<commit_message>
Add Jabal al-Dukhan scene with Saudi and Houthi accounts and sources
Co-Authored-By: Claude Opus 5.5 <noreply@anthropic.com>
Claude-Session: https://claude.ai/code/session_01BzBddbBqnKQREhg3tZEvDi
</commit_message>
<xml_diff>
--- a/video/houthi-history/script.docx
+++ b/video/houthi-history/script.docx
@@ -234,7 +234,7 @@
                 <w:szCs w:val="22"/>
                 <w:rtl/>
               </w:rPr>
-              <w:t xml:space="preserve">8 إلى 9 دقائق (حوالي 1050 كلمة بإيقاع قراءة هادئ)</w:t>
+              <w:t xml:space="preserve">9 إلى 10 دقائق (حوالي 1150 كلمة بإيقاع قراءة هادئ)</w:t>
             </w:r>
           </w:p>
         </w:tc>
@@ -2884,7 +2884,7 @@
           <w:szCs w:val="24"/>
           <w:rtl w:val="false"/>
         </w:rPr>
-        <w:t xml:space="preserve">   2:45 – 3:45</w:t>
+        <w:t xml:space="preserve">   2:45 – 4:30</w:t>
       </w:r>
     </w:p>
     <w:p>
@@ -3326,7 +3326,7 @@
                 <w:szCs w:val="23"/>
                 <w:rtl/>
               </w:rPr>
-              <w:t xml:space="preserve">ستة أرقام تظهر تباعاً على الخط الزمني (2004، 2005، 2006–2007، 2008، 2008، 2009–2010). مع كل حرب تتسع البقعة الخضراء حول صعدة. في الحرب السادسة يظهر سهم من الشمال يمثل دخول السعودية. يظهر الرسم الخطي لعبد الملك الحوثي.</w:t>
+              <w:t xml:space="preserve">ستة أرقام تظهر تباعاً على الخط الزمني (2004، 2005، 2006–2007، 2008، 2008، 2009–2010). مع كل حرب تتسع البقعة الخضراء حول صعدة. يظهر الرسم الخطي لعبد الملك الحوثي. عند الرقم السادس تتجه الكاميرا شمالاً نحو خط الحدود السعودية.</w:t>
             </w:r>
           </w:p>
         </w:tc>
@@ -3405,7 +3405,7 @@
                 <w:szCs w:val="23"/>
                 <w:rtl/>
               </w:rPr>
-              <w:t xml:space="preserve">«2004 – 2010: ست حروب» / «القيادة: عبد الملك الحوثي»</w:t>
+              <w:t xml:space="preserve">«2004 – 2010: ست حروب» / «القيادة: عبد الملك الحوثي» / «أغسطس 2009: الحرب السادسة»</w:t>
             </w:r>
           </w:p>
         </w:tc>
@@ -3527,27 +3527,7 @@
                 <w:szCs w:val="26"/>
                 <w:rtl/>
               </w:rPr>
-              <w:t xml:space="preserve">في الحرب السادسة، أواخر عام ألفين وتسعة، اشتبك الحوثيون مع القوات السعودية على الحدود، فكانت أول مواجهة مباشرة بين الطرفين.</w:t>
-            </w:r>
-          </w:p>
-          <w:p>
-            <w:pPr>
-              <w:bidi/>
-              <w:spacing w:after="100" w:line="360"/>
-              <w:jc w:val="both"/>
-            </w:pPr>
-            <w:r>
-              <w:rPr>
-                <w:rFonts w:ascii="Arial" w:cs="Arial" w:eastAsia="Arial" w:hAnsi="Arial"/>
-                <w:b/>
-                <w:bCs/>
-                <w:i w:val="false"/>
-                <w:color w:val="1E1B16"/>
-                <w:sz w:val="26"/>
-                <w:szCs w:val="26"/>
-                <w:rtl/>
-              </w:rPr>
-              <w:t xml:space="preserve">وفي فبراير ألفين وعشرة، توقفت الحرب بهدنة هشة، وخرجت الحركة منها أقوى مما دخلتها.</w:t>
+              <w:t xml:space="preserve">وفي الحرب السادسة، التي بدأت في أغسطس ألفين وتسعة، تجاوزت النيران حدود اليمن لأول مرة.</w:t>
             </w:r>
           </w:p>
         </w:tc>
@@ -3561,42 +3541,6 @@
     </w:p>
     <w:p>
       <w:pPr>
-        <w:pStyle w:val="Heading1"/>
-        <w:keepNext/>
-        <w:pBdr>
-          <w:bottom w:val="single" w:color="C0392B" w:sz="12" w:space="6"/>
-        </w:pBdr>
-        <w:bidi/>
-        <w:spacing w:after="200" w:before="360"/>
-      </w:pPr>
-      <w:r>
-        <w:rPr>
-          <w:rFonts w:ascii="Arial" w:cs="Arial" w:eastAsia="Arial" w:hAnsi="Arial"/>
-          <w:b/>
-          <w:bCs/>
-          <w:i w:val="false"/>
-          <w:color w:val="C0392B"/>
-          <w:sz w:val="34"/>
-          <w:szCs w:val="34"/>
-          <w:rtl/>
-        </w:rPr>
-        <w:t xml:space="preserve">الفصل الخامس: الربيع والفراغ</w:t>
-      </w:r>
-      <w:r>
-        <w:rPr>
-          <w:rFonts w:ascii="Arial" w:cs="Arial" w:eastAsia="Arial" w:hAnsi="Arial"/>
-          <w:b w:val="false"/>
-          <w:i w:val="false"/>
-          <w:color w:val="6B6358"/>
-          <w:sz w:val="24"/>
-          <w:szCs w:val="24"/>
-          <w:rtl w:val="false"/>
-        </w:rPr>
-        <w:t xml:space="preserve">   3:45 – 4:25</w:t>
-      </w:r>
-    </w:p>
-    <w:p>
-      <w:pPr>
         <w:pStyle w:val="Heading2"/>
         <w:keepNext/>
         <w:bidi/>
@@ -3613,7 +3557,7 @@
           <w:szCs w:val="28"/>
           <w:rtl/>
         </w:rPr>
-        <w:t xml:space="preserve">المشهد 9: ثورة 2011</w:t>
+        <w:t xml:space="preserve">المشهد 9: جبل الدخان، حادثة واحدة وروايتان</w:t>
       </w:r>
     </w:p>
     <w:tbl>
@@ -3708,7 +3652,7 @@
                 <w:szCs w:val="23"/>
                 <w:rtl/>
               </w:rPr>
-              <w:t xml:space="preserve">حشود متحركة بأسلوب الرسوم المسطحة في ساحة التغيير بصنعاء. لافتات ترتفع. صورة صالح تتلاشى ويحل محلها عبد ربه منصور هادي. في الأعلى، صعدة تتلوّن بالكامل بالأخضر.</w:t>
+              <w:t xml:space="preserve">خريطة طبوغرافية تقترب من الحدود السعودية اليمنية في منطقة جازان. يرتفع جبل الدخان ثلاثي الأبعاد، ويمر عبره خط الحدود المتقطع. تظهر أيقونة دورية لحرس الحدود قرب مركز «الخُلَد» الحدودي، ثم ومضة إطلاق نار. تتجمد الصورة وتنقسم الشاشة نصفين: يميناً بطاقة «الرواية السعودية» بإطار أزرق، ويساراً بطاقة «الرواية الحوثية» بإطار زيتي. بعدها تعبر أيقونات طائرات من الشمال، ويرتفع علم فوق الجبل ويقابله ختم «نفي». في النهاية سهم ينسحب جنوباً ويظهر تاريخ يناير 2010.</w:t>
             </w:r>
           </w:p>
         </w:tc>
@@ -3787,7 +3731,7 @@
                 <w:szCs w:val="23"/>
                 <w:rtl/>
               </w:rPr>
-              <w:t xml:space="preserve">«2011: الثورة الشبابية» / «2012: هادي رئيساً» / «2013 – 2014: مؤتمر الحوار الوطني»</w:t>
+              <w:t xml:space="preserve">«3 نوفمبر 2009: إطلاق نار على دورية لحرس الحدود في جبل الدخان» / «الرواية السعودية: متسللون من اليمن قتلوا رجل أمن وأصابوا 11» / «الرواية الحوثية: الرياض سمحت للجيش اليمني باستخدام الجبل ضدنا» / «يناير 2010: انسحاب الحوثيين من الأراضي السعودية»</w:t>
             </w:r>
           </w:p>
         </w:tc>
@@ -3869,7 +3813,7 @@
                 <w:szCs w:val="26"/>
                 <w:rtl/>
               </w:rPr>
-              <w:t xml:space="preserve">عام ألفين وأحد عشر، خرج اليمنيون إلى الشوارع ضد حكم صالح، وانضم الحوثيون إلى الساحات.</w:t>
+              <w:t xml:space="preserve">في الثالث من نوفمبر عام ألفين وتسعة، وصلت المعارك إلى جبل الدخان، وهو جبل يمر به خط الحدود بين اليمن ومنطقة جازان السعودية.</w:t>
             </w:r>
           </w:p>
           <w:p>
@@ -3889,7 +3833,7 @@
                 <w:szCs w:val="26"/>
                 <w:rtl/>
               </w:rPr>
-              <w:t xml:space="preserve">ومع انشغال الدولة، بسطوا سيطرتهم الكاملة على محافظة صعدة، وأصبحوا يقدمون أنفسهم باسم «أنصار الله».</w:t>
+              <w:t xml:space="preserve">تقول الرواية السعودية الرسمية إن مسلحين تسللوا من اليمن إلى الجزء السعودي من الجبل، وأطلقوا النار على دوريات حرس الحدود، فقتلوا رجل أمن وأصابوا أحد عشر آخرين.</w:t>
             </w:r>
           </w:p>
           <w:p>
@@ -3909,7 +3853,7 @@
                 <w:szCs w:val="26"/>
                 <w:rtl/>
               </w:rPr>
-              <w:t xml:space="preserve">تنحى صالح بموجب المبادرة الخليجية، وتولى نائبه عبد ربه منصور هادي الرئاسة، وشارك الحوثيون في مؤتمر الحوار الوطني.</w:t>
+              <w:t xml:space="preserve">أما الحوثيون، فأقرّوا بوقوع الاشتباك، وقالوا إنهم دخلوا الجبل لأن السعودية سمحت للجيش اليمني باستخدامه لمهاجمتهم من الخلف، وأعلنوا السيطرة عليه. لكن الرياض وصنعاء نفتا ذلك.</w:t>
             </w:r>
           </w:p>
           <w:p>
@@ -3929,7 +3873,67 @@
                 <w:szCs w:val="26"/>
                 <w:rtl/>
               </w:rPr>
-              <w:t xml:space="preserve">لكنهم رفضوا مخرجاته، وخاصة تقسيم البلاد إلى ستة أقاليم.</w:t>
+              <w:t xml:space="preserve">ردّت السعودية بغارات جوية وعمليات برية، وأعلنت بعد أيام استعادة الجبل بالكامل، بينما نفى الحوثيون أنهم خسروه.</w:t>
+            </w:r>
+          </w:p>
+          <w:p>
+            <w:pPr>
+              <w:bidi/>
+              <w:spacing w:after="100" w:line="360"/>
+              <w:jc w:val="both"/>
+            </w:pPr>
+            <w:r>
+              <w:rPr>
+                <w:rFonts w:ascii="Arial" w:cs="Arial" w:eastAsia="Arial" w:hAnsi="Arial"/>
+                <w:b/>
+                <w:bCs/>
+                <w:i w:val="false"/>
+                <w:color w:val="1E1B16"/>
+                <w:sz w:val="26"/>
+                <w:szCs w:val="26"/>
+                <w:rtl/>
+              </w:rPr>
+              <w:t xml:space="preserve">استمرت المواجهات قرابة ثلاثة أشهر، حتى أعلن عبد الملك الحوثي، أواخر يناير ألفين وعشرة، الانسحاب من الأراضي السعودية.</w:t>
+            </w:r>
+          </w:p>
+          <w:p>
+            <w:pPr>
+              <w:bidi/>
+              <w:spacing w:after="100" w:line="360"/>
+              <w:jc w:val="both"/>
+            </w:pPr>
+            <w:r>
+              <w:rPr>
+                <w:rFonts w:ascii="Arial" w:cs="Arial" w:eastAsia="Arial" w:hAnsi="Arial"/>
+                <w:b/>
+                <w:bCs/>
+                <w:i w:val="false"/>
+                <w:color w:val="1E1B16"/>
+                <w:sz w:val="26"/>
+                <w:szCs w:val="26"/>
+                <w:rtl/>
+              </w:rPr>
+              <w:t xml:space="preserve">كانت تلك أول حرب مباشرة بين الطرفين. خرج منها الحوثيون بصورة من صمد أمام جيش إقليمي كبير، وخرجت منها الرياض مقتنعة بأن الحركة خطر على حدودها.</w:t>
+            </w:r>
+          </w:p>
+          <w:p>
+            <w:pPr>
+              <w:bidi/>
+              <w:spacing w:after="100" w:line="360"/>
+              <w:jc w:val="both"/>
+            </w:pPr>
+            <w:r>
+              <w:rPr>
+                <w:rFonts w:ascii="Arial" w:cs="Arial" w:eastAsia="Arial" w:hAnsi="Arial"/>
+                <w:b/>
+                <w:bCs/>
+                <w:i w:val="false"/>
+                <w:color w:val="1E1B16"/>
+                <w:sz w:val="26"/>
+                <w:szCs w:val="26"/>
+                <w:rtl/>
+              </w:rPr>
+              <w:t xml:space="preserve">وفي فبراير ألفين وعشرة، توقفت الحرب السادسة بهدنة هشة.</w:t>
             </w:r>
           </w:p>
         </w:tc>
@@ -3962,7 +3966,7 @@
           <w:szCs w:val="34"/>
           <w:rtl/>
         </w:rPr>
-        <w:t xml:space="preserve">الفصل السادس: الطريق إلى صنعاء</w:t>
+        <w:t xml:space="preserve">الفصل الخامس: الربيع والفراغ</w:t>
       </w:r>
       <w:r>
         <w:rPr>
@@ -3974,7 +3978,7 @@
           <w:szCs w:val="24"/>
           <w:rtl w:val="false"/>
         </w:rPr>
-        <w:t xml:space="preserve">   4:25 – 5:10</w:t>
+        <w:t xml:space="preserve">   4:30 – 5:10</w:t>
       </w:r>
     </w:p>
     <w:p>
@@ -3995,7 +3999,7 @@
           <w:szCs w:val="28"/>
           <w:rtl/>
         </w:rPr>
-        <w:t xml:space="preserve">المشهد 10: الزحف جنوباً</w:t>
+        <w:t xml:space="preserve">المشهد 10: ثورة 2011</w:t>
       </w:r>
     </w:p>
     <w:tbl>
@@ -4090,7 +4094,7 @@
                 <w:szCs w:val="23"/>
                 <w:rtl/>
               </w:rPr>
-              <w:t xml:space="preserve">خريطة تبدأ من صعدة، وسهم أخضر يتحرك جنوباً فيمر بدماج ثم عمران (يوليو 2014) ثم يصل إلى بوابة صنعاء. عداد التاريخ يتسارع.</w:t>
+              <w:t xml:space="preserve">حشود متحركة بأسلوب الرسوم المسطحة في ساحة التغيير بصنعاء. لافتات ترتفع. صورة صالح تتلاشى ويحل محلها عبد ربه منصور هادي. في الأعلى، صعدة تتلوّن بالكامل بالأخضر.</w:t>
             </w:r>
           </w:p>
         </w:tc>
@@ -4169,7 +4173,7 @@
                 <w:szCs w:val="23"/>
                 <w:rtl/>
               </w:rPr>
-              <w:t xml:space="preserve">«يناير 2014: دماج» / «يوليو 2014: عمران» / «21 سبتمبر 2014: صنعاء»</w:t>
+              <w:t xml:space="preserve">«2011: الثورة الشبابية» / «2012: هادي رئيساً» / «2013 – 2014: مؤتمر الحوار الوطني»</w:t>
             </w:r>
           </w:p>
         </w:tc>
@@ -4251,7 +4255,7 @@
                 <w:szCs w:val="26"/>
                 <w:rtl/>
               </w:rPr>
-              <w:t xml:space="preserve">بدأ التوسع العسكري. في مطلع ألفين وأربعة عشر انتهت معارك دماج بتهجير طلاب المعهد السلفي، ثم سقطت عمران في يوليو.</w:t>
+              <w:t xml:space="preserve">عام ألفين وأحد عشر، خرج اليمنيون إلى الشوارع ضد حكم صالح، وانضم الحوثيون إلى الساحات.</w:t>
             </w:r>
           </w:p>
           <w:p>
@@ -4271,7 +4275,7 @@
                 <w:szCs w:val="26"/>
                 <w:rtl/>
               </w:rPr>
-              <w:t xml:space="preserve">وحين رفعت الحكومة أسعار الوقود، رفع الحوثيون شعار الدفاع عن الفقراء، ونصبوا مخيمات الاحتجاج حول العاصمة.</w:t>
+              <w:t xml:space="preserve">ومع انشغال الدولة، بسطوا سيطرتهم الكاملة على محافظة صعدة، وأصبحوا يقدمون أنفسهم باسم «أنصار الله».</w:t>
             </w:r>
           </w:p>
           <w:p>
@@ -4291,7 +4295,7 @@
                 <w:szCs w:val="26"/>
                 <w:rtl/>
               </w:rPr>
-              <w:t xml:space="preserve">وفي الحادي والعشرين من سبتمبر عام ألفين وأربعة عشر، دخلوا صنعاء دون مقاومة تُذكر من وحدات كبيرة في الجيش.</w:t>
+              <w:t xml:space="preserve">تنحى صالح بموجب المبادرة الخليجية، وتولى نائبه عبد ربه منصور هادي الرئاسة، وشارك الحوثيون في مؤتمر الحوار الوطني.</w:t>
             </w:r>
           </w:p>
           <w:p>
@@ -4311,7 +4315,7 @@
                 <w:szCs w:val="26"/>
                 <w:rtl/>
               </w:rPr>
-              <w:t xml:space="preserve">وكان ذلك بمساعدة حليف غير متوقع: خصمهم القديم علي عبد الله صالح، الذي ظل يحتفظ بنفوذه داخل المؤسسة العسكرية.</w:t>
+              <w:t xml:space="preserve">لكنهم رفضوا مخرجاته، وخاصة تقسيم البلاد إلى ستة أقاليم.</w:t>
             </w:r>
           </w:p>
         </w:tc>
@@ -4325,6 +4329,42 @@
     </w:p>
     <w:p>
       <w:pPr>
+        <w:pStyle w:val="Heading1"/>
+        <w:keepNext/>
+        <w:pBdr>
+          <w:bottom w:val="single" w:color="C0392B" w:sz="12" w:space="6"/>
+        </w:pBdr>
+        <w:bidi/>
+        <w:spacing w:after="200" w:before="360"/>
+      </w:pPr>
+      <w:r>
+        <w:rPr>
+          <w:rFonts w:ascii="Arial" w:cs="Arial" w:eastAsia="Arial" w:hAnsi="Arial"/>
+          <w:b/>
+          <w:bCs/>
+          <w:i w:val="false"/>
+          <w:color w:val="C0392B"/>
+          <w:sz w:val="34"/>
+          <w:szCs w:val="34"/>
+          <w:rtl/>
+        </w:rPr>
+        <w:t xml:space="preserve">الفصل السادس: الطريق إلى صنعاء</w:t>
+      </w:r>
+      <w:r>
+        <w:rPr>
+          <w:rFonts w:ascii="Arial" w:cs="Arial" w:eastAsia="Arial" w:hAnsi="Arial"/>
+          <w:b w:val="false"/>
+          <w:i w:val="false"/>
+          <w:color w:val="6B6358"/>
+          <w:sz w:val="24"/>
+          <w:szCs w:val="24"/>
+          <w:rtl w:val="false"/>
+        </w:rPr>
+        <w:t xml:space="preserve">   5:10 – 5:55</w:t>
+      </w:r>
+    </w:p>
+    <w:p>
+      <w:pPr>
         <w:pStyle w:val="Heading2"/>
         <w:keepNext/>
         <w:bidi/>
@@ -4341,7 +4381,7 @@
           <w:szCs w:val="28"/>
           <w:rtl/>
         </w:rPr>
-        <w:t xml:space="preserve">المشهد 11: روايتان</w:t>
+        <w:t xml:space="preserve">المشهد 11: الزحف جنوباً</w:t>
       </w:r>
     </w:p>
     <w:tbl>
@@ -4436,7 +4476,7 @@
                 <w:szCs w:val="23"/>
                 <w:rtl/>
               </w:rPr>
-              <w:t xml:space="preserve">شاشة مقسومة نصفين. يميناً عبارة «ثورة 21 سبتمبر»، ويساراً عبارة «انقلاب على الشرعية». خط فاصل يرتجف بينهما.</w:t>
+              <w:t xml:space="preserve">خريطة تبدأ من صعدة، وسهم أخضر يتحرك جنوباً فيمر بدماج ثم عمران (يوليو 2014) ثم يصل إلى بوابة صنعاء. عداد التاريخ يتسارع.</w:t>
             </w:r>
           </w:p>
         </w:tc>
@@ -4474,6 +4514,85 @@
                 <w:b/>
                 <w:bCs/>
                 <w:i w:val="false"/>
+                <w:color w:val="6B7F3A"/>
+                <w:sz w:val="22"/>
+                <w:szCs w:val="22"/>
+                <w:rtl/>
+              </w:rPr>
+              <w:t xml:space="preserve">النص على الشاشة</w:t>
+            </w:r>
+          </w:p>
+        </w:tc>
+        <w:tc>
+          <w:tcPr>
+            <w:tcW w:type="dxa" w:w="7206"/>
+            <w:tcBorders>
+              <w:top w:val="single" w:color="D5CAB8" w:sz="4"/>
+              <w:left w:val="single" w:color="D5CAB8" w:sz="4"/>
+              <w:bottom w:val="single" w:color="D5CAB8" w:sz="4"/>
+              <w:right w:val="single" w:color="D5CAB8" w:sz="4"/>
+            </w:tcBorders>
+            <w:tcMar>
+              <w:top w:type="dxa" w:w="100"/>
+              <w:left w:type="dxa" w:w="140"/>
+              <w:bottom w:type="dxa" w:w="100"/>
+              <w:right w:type="dxa" w:w="140"/>
+            </w:tcMar>
+            <w:vAlign w:val="top"/>
+          </w:tcPr>
+          <w:p>
+            <w:pPr>
+              <w:bidi/>
+              <w:spacing w:after="0" w:line="300"/>
+            </w:pPr>
+            <w:r>
+              <w:rPr>
+                <w:rFonts w:ascii="Arial" w:cs="Arial" w:eastAsia="Arial" w:hAnsi="Arial"/>
+                <w:b w:val="false"/>
+                <w:i w:val="false"/>
+                <w:color w:val="1E1B16"/>
+                <w:sz w:val="23"/>
+                <w:szCs w:val="23"/>
+                <w:rtl/>
+              </w:rPr>
+              <w:t xml:space="preserve">«يناير 2014: دماج» / «يوليو 2014: عمران» / «21 سبتمبر 2014: صنعاء»</w:t>
+            </w:r>
+          </w:p>
+        </w:tc>
+      </w:tr>
+      <w:tr>
+        <w:trPr>
+          <w:cantSplit/>
+        </w:trPr>
+        <w:tc>
+          <w:tcPr>
+            <w:tcW w:type="dxa" w:w="2100"/>
+            <w:tcBorders>
+              <w:top w:val="single" w:color="D5CAB8" w:sz="4"/>
+              <w:left w:val="single" w:color="D5CAB8" w:sz="4"/>
+              <w:bottom w:val="single" w:color="D5CAB8" w:sz="4"/>
+              <w:right w:val="single" w:color="D5CAB8" w:sz="4"/>
+            </w:tcBorders>
+            <w:shd w:fill="F4EEE4" w:color="auto" w:val="clear"/>
+            <w:tcMar>
+              <w:top w:type="dxa" w:w="100"/>
+              <w:left w:type="dxa" w:w="140"/>
+              <w:bottom w:type="dxa" w:w="100"/>
+              <w:right w:type="dxa" w:w="140"/>
+            </w:tcMar>
+            <w:vAlign w:val="top"/>
+          </w:tcPr>
+          <w:p>
+            <w:pPr>
+              <w:bidi/>
+              <w:spacing w:after="0"/>
+            </w:pPr>
+            <w:r>
+              <w:rPr>
+                <w:rFonts w:ascii="Arial" w:cs="Arial" w:eastAsia="Arial" w:hAnsi="Arial"/>
+                <w:b/>
+                <w:bCs/>
+                <w:i w:val="false"/>
                 <w:color w:val="C0392B"/>
                 <w:sz w:val="22"/>
                 <w:szCs w:val="22"/>
@@ -4518,7 +4637,67 @@
                 <w:szCs w:val="26"/>
                 <w:rtl/>
               </w:rPr>
-              <w:t xml:space="preserve">يسمي الحوثيون ما حدث «ثورة الحادي والعشرين من سبتمبر»، بينما تصفه الحكومة المعترف بها دولياً وحلفاؤها بأنه «انقلاب على الشرعية».</w:t>
+              <w:t xml:space="preserve">بدأ التوسع العسكري. في مطلع ألفين وأربعة عشر انتهت معارك دماج بتهجير طلاب المعهد السلفي، ثم سقطت عمران في يوليو.</w:t>
+            </w:r>
+          </w:p>
+          <w:p>
+            <w:pPr>
+              <w:bidi/>
+              <w:spacing w:after="100" w:line="360"/>
+              <w:jc w:val="both"/>
+            </w:pPr>
+            <w:r>
+              <w:rPr>
+                <w:rFonts w:ascii="Arial" w:cs="Arial" w:eastAsia="Arial" w:hAnsi="Arial"/>
+                <w:b/>
+                <w:bCs/>
+                <w:i w:val="false"/>
+                <w:color w:val="1E1B16"/>
+                <w:sz w:val="26"/>
+                <w:szCs w:val="26"/>
+                <w:rtl/>
+              </w:rPr>
+              <w:t xml:space="preserve">وحين رفعت الحكومة أسعار الوقود، رفع الحوثيون شعار الدفاع عن الفقراء، ونصبوا مخيمات الاحتجاج حول العاصمة.</w:t>
+            </w:r>
+          </w:p>
+          <w:p>
+            <w:pPr>
+              <w:bidi/>
+              <w:spacing w:after="100" w:line="360"/>
+              <w:jc w:val="both"/>
+            </w:pPr>
+            <w:r>
+              <w:rPr>
+                <w:rFonts w:ascii="Arial" w:cs="Arial" w:eastAsia="Arial" w:hAnsi="Arial"/>
+                <w:b/>
+                <w:bCs/>
+                <w:i w:val="false"/>
+                <w:color w:val="1E1B16"/>
+                <w:sz w:val="26"/>
+                <w:szCs w:val="26"/>
+                <w:rtl/>
+              </w:rPr>
+              <w:t xml:space="preserve">وفي الحادي والعشرين من سبتمبر عام ألفين وأربعة عشر، دخلوا صنعاء دون مقاومة تُذكر من وحدات كبيرة في الجيش.</w:t>
+            </w:r>
+          </w:p>
+          <w:p>
+            <w:pPr>
+              <w:bidi/>
+              <w:spacing w:after="100" w:line="360"/>
+              <w:jc w:val="both"/>
+            </w:pPr>
+            <w:r>
+              <w:rPr>
+                <w:rFonts w:ascii="Arial" w:cs="Arial" w:eastAsia="Arial" w:hAnsi="Arial"/>
+                <w:b/>
+                <w:bCs/>
+                <w:i w:val="false"/>
+                <w:color w:val="1E1B16"/>
+                <w:sz w:val="26"/>
+                <w:szCs w:val="26"/>
+                <w:rtl/>
+              </w:rPr>
+              <w:t xml:space="preserve">وكان ذلك بمساعدة حليف غير متوقع: خصمهم القديم علي عبد الله صالح، الذي ظل يحتفظ بنفوذه داخل المؤسسة العسكرية.</w:t>
             </w:r>
           </w:p>
         </w:tc>
@@ -4532,42 +4711,6 @@
     </w:p>
     <w:p>
       <w:pPr>
-        <w:pStyle w:val="Heading1"/>
-        <w:keepNext/>
-        <w:pBdr>
-          <w:bottom w:val="single" w:color="C0392B" w:sz="12" w:space="6"/>
-        </w:pBdr>
-        <w:bidi/>
-        <w:spacing w:after="200" w:before="360"/>
-      </w:pPr>
-      <w:r>
-        <w:rPr>
-          <w:rFonts w:ascii="Arial" w:cs="Arial" w:eastAsia="Arial" w:hAnsi="Arial"/>
-          <w:b/>
-          <w:bCs/>
-          <w:i w:val="false"/>
-          <w:color w:val="C0392B"/>
-          <w:sz w:val="34"/>
-          <w:szCs w:val="34"/>
-          <w:rtl/>
-        </w:rPr>
-        <w:t xml:space="preserve">الفصل السابع: الحرب الكبرى</w:t>
-      </w:r>
-      <w:r>
-        <w:rPr>
-          <w:rFonts w:ascii="Arial" w:cs="Arial" w:eastAsia="Arial" w:hAnsi="Arial"/>
-          <w:b w:val="false"/>
-          <w:i w:val="false"/>
-          <w:color w:val="6B6358"/>
-          <w:sz w:val="24"/>
-          <w:szCs w:val="24"/>
-          <w:rtl w:val="false"/>
-        </w:rPr>
-        <w:t xml:space="preserve">   5:10 – 6:00</w:t>
-      </w:r>
-    </w:p>
-    <w:p>
-      <w:pPr>
         <w:pStyle w:val="Heading2"/>
         <w:keepNext/>
         <w:bidi/>
@@ -4584,7 +4727,7 @@
           <w:szCs w:val="28"/>
           <w:rtl/>
         </w:rPr>
-        <w:t xml:space="preserve">المشهد 12: سقوط الرئاسة</w:t>
+        <w:t xml:space="preserve">المشهد 12: روايتان</w:t>
       </w:r>
     </w:p>
     <w:tbl>
@@ -4679,7 +4822,7 @@
                 <w:szCs w:val="23"/>
                 <w:rtl/>
               </w:rPr>
-              <w:t xml:space="preserve">أيقونة القصر الرئاسي يلتف حولها شريط أخضر. ورقة استقالة تطير. خط متقطع يرسم رحلة هادي من صنعاء إلى عدن ثم إلى الرياض.</w:t>
+              <w:t xml:space="preserve">شاشة مقسومة نصفين. يميناً عبارة «ثورة 21 سبتمبر»، ويساراً عبارة «انقلاب على الشرعية». خط فاصل يرتجف بينهما.</w:t>
             </w:r>
           </w:p>
         </w:tc>
@@ -4717,85 +4860,6 @@
                 <w:b/>
                 <w:bCs/>
                 <w:i w:val="false"/>
-                <w:color w:val="6B7F3A"/>
-                <w:sz w:val="22"/>
-                <w:szCs w:val="22"/>
-                <w:rtl/>
-              </w:rPr>
-              <w:t xml:space="preserve">النص على الشاشة</w:t>
-            </w:r>
-          </w:p>
-        </w:tc>
-        <w:tc>
-          <w:tcPr>
-            <w:tcW w:type="dxa" w:w="7206"/>
-            <w:tcBorders>
-              <w:top w:val="single" w:color="D5CAB8" w:sz="4"/>
-              <w:left w:val="single" w:color="D5CAB8" w:sz="4"/>
-              <w:bottom w:val="single" w:color="D5CAB8" w:sz="4"/>
-              <w:right w:val="single" w:color="D5CAB8" w:sz="4"/>
-            </w:tcBorders>
-            <w:tcMar>
-              <w:top w:type="dxa" w:w="100"/>
-              <w:left w:type="dxa" w:w="140"/>
-              <w:bottom w:type="dxa" w:w="100"/>
-              <w:right w:type="dxa" w:w="140"/>
-            </w:tcMar>
-            <w:vAlign w:val="top"/>
-          </w:tcPr>
-          <w:p>
-            <w:pPr>
-              <w:bidi/>
-              <w:spacing w:after="0" w:line="300"/>
-            </w:pPr>
-            <w:r>
-              <w:rPr>
-                <w:rFonts w:ascii="Arial" w:cs="Arial" w:eastAsia="Arial" w:hAnsi="Arial"/>
-                <w:b w:val="false"/>
-                <w:i w:val="false"/>
-                <w:color w:val="1E1B16"/>
-                <w:sz w:val="23"/>
-                <w:szCs w:val="23"/>
-                <w:rtl/>
-              </w:rPr>
-              <w:t xml:space="preserve">«يناير 2015: استقالة هادي» / «فبراير 2015: الإعلان الدستوري»</w:t>
-            </w:r>
-          </w:p>
-        </w:tc>
-      </w:tr>
-      <w:tr>
-        <w:trPr>
-          <w:cantSplit/>
-        </w:trPr>
-        <w:tc>
-          <w:tcPr>
-            <w:tcW w:type="dxa" w:w="2100"/>
-            <w:tcBorders>
-              <w:top w:val="single" w:color="D5CAB8" w:sz="4"/>
-              <w:left w:val="single" w:color="D5CAB8" w:sz="4"/>
-              <w:bottom w:val="single" w:color="D5CAB8" w:sz="4"/>
-              <w:right w:val="single" w:color="D5CAB8" w:sz="4"/>
-            </w:tcBorders>
-            <w:shd w:fill="F4EEE4" w:color="auto" w:val="clear"/>
-            <w:tcMar>
-              <w:top w:type="dxa" w:w="100"/>
-              <w:left w:type="dxa" w:w="140"/>
-              <w:bottom w:type="dxa" w:w="100"/>
-              <w:right w:type="dxa" w:w="140"/>
-            </w:tcMar>
-            <w:vAlign w:val="top"/>
-          </w:tcPr>
-          <w:p>
-            <w:pPr>
-              <w:bidi/>
-              <w:spacing w:after="0"/>
-            </w:pPr>
-            <w:r>
-              <w:rPr>
-                <w:rFonts w:ascii="Arial" w:cs="Arial" w:eastAsia="Arial" w:hAnsi="Arial"/>
-                <w:b/>
-                <w:bCs/>
-                <w:i w:val="false"/>
                 <w:color w:val="C0392B"/>
                 <w:sz w:val="22"/>
                 <w:szCs w:val="22"/>
@@ -4840,27 +4904,7 @@
                 <w:szCs w:val="26"/>
                 <w:rtl/>
               </w:rPr>
-              <w:t xml:space="preserve">في يناير ألفين وخمسة عشر حاصر الحوثيون القصر الرئاسي، فقدّم هادي استقالته وفُرضت عليه الإقامة الجبرية.</w:t>
-            </w:r>
-          </w:p>
-          <w:p>
-            <w:pPr>
-              <w:bidi/>
-              <w:spacing w:after="100" w:line="360"/>
-              <w:jc w:val="both"/>
-            </w:pPr>
-            <w:r>
-              <w:rPr>
-                <w:rFonts w:ascii="Arial" w:cs="Arial" w:eastAsia="Arial" w:hAnsi="Arial"/>
-                <w:b/>
-                <w:bCs/>
-                <w:i w:val="false"/>
-                <w:color w:val="1E1B16"/>
-                <w:sz w:val="26"/>
-                <w:szCs w:val="26"/>
-                <w:rtl/>
-              </w:rPr>
-              <w:t xml:space="preserve">وفي فبراير أصدروا «إعلاناً دستورياً» حلّوا به البرلمان، لكن هادي فرّ إلى عدن وتراجع عن استقالته، فتقدم الحوثيون جنوباً نحوه.</w:t>
+              <w:t xml:space="preserve">يسمي الحوثيون ما حدث «ثورة الحادي والعشرين من سبتمبر»، بينما تصفه الحكومة المعترف بها دولياً وحلفاؤها بأنه «انقلاب على الشرعية».</w:t>
             </w:r>
           </w:p>
         </w:tc>
@@ -4874,6 +4918,42 @@
     </w:p>
     <w:p>
       <w:pPr>
+        <w:pStyle w:val="Heading1"/>
+        <w:keepNext/>
+        <w:pBdr>
+          <w:bottom w:val="single" w:color="C0392B" w:sz="12" w:space="6"/>
+        </w:pBdr>
+        <w:bidi/>
+        <w:spacing w:after="200" w:before="360"/>
+      </w:pPr>
+      <w:r>
+        <w:rPr>
+          <w:rFonts w:ascii="Arial" w:cs="Arial" w:eastAsia="Arial" w:hAnsi="Arial"/>
+          <w:b/>
+          <w:bCs/>
+          <w:i w:val="false"/>
+          <w:color w:val="C0392B"/>
+          <w:sz w:val="34"/>
+          <w:szCs w:val="34"/>
+          <w:rtl/>
+        </w:rPr>
+        <w:t xml:space="preserve">الفصل السابع: الحرب الكبرى</w:t>
+      </w:r>
+      <w:r>
+        <w:rPr>
+          <w:rFonts w:ascii="Arial" w:cs="Arial" w:eastAsia="Arial" w:hAnsi="Arial"/>
+          <w:b w:val="false"/>
+          <w:i w:val="false"/>
+          <w:color w:val="6B6358"/>
+          <w:sz w:val="24"/>
+          <w:szCs w:val="24"/>
+          <w:rtl w:val="false"/>
+        </w:rPr>
+        <w:t xml:space="preserve">   5:55 – 6:45</w:t>
+      </w:r>
+    </w:p>
+    <w:p>
+      <w:pPr>
         <w:pStyle w:val="Heading2"/>
         <w:keepNext/>
         <w:bidi/>
@@ -4890,7 +4970,7 @@
           <w:szCs w:val="28"/>
           <w:rtl/>
         </w:rPr>
-        <w:t xml:space="preserve">المشهد 13: عاصفة الحزم</w:t>
+        <w:t xml:space="preserve">المشهد 13: سقوط الرئاسة</w:t>
       </w:r>
     </w:p>
     <w:tbl>
@@ -4985,7 +5065,7 @@
                 <w:szCs w:val="23"/>
                 <w:rtl/>
               </w:rPr>
-              <w:t xml:space="preserve">ليل، أيقونات طائرات تعبر من الشمال، ووميض انفجارات صامتة على الخريطة. تظهر أعلام دول التحالف صفاً واحداً، ثم وثيقة القرار الأممي 2216.</w:t>
+              <w:t xml:space="preserve">أيقونة القصر الرئاسي يلتف حولها شريط أخضر. ورقة استقالة تطير. خط متقطع يرسم رحلة هادي من صنعاء إلى عدن ثم إلى الرياض.</w:t>
             </w:r>
           </w:p>
         </w:tc>
@@ -5064,7 +5144,7 @@
                 <w:szCs w:val="23"/>
                 <w:rtl/>
               </w:rPr>
-              <w:t xml:space="preserve">«26 مارس 2015: عاصفة الحزم» / «قرار مجلس الأمن 2216»</w:t>
+              <w:t xml:space="preserve">«يناير 2015: استقالة هادي» / «فبراير 2015: الإعلان الدستوري»</w:t>
             </w:r>
           </w:p>
         </w:tc>
@@ -5146,7 +5226,7 @@
                 <w:szCs w:val="26"/>
                 <w:rtl/>
               </w:rPr>
-              <w:t xml:space="preserve">في السادس والعشرين من مارس ألفين وخمسة عشر، أطلقت السعودية على رأس تحالف عربي عملية «عاصفة الحزم» لإعادة حكومة هادي.</w:t>
+              <w:t xml:space="preserve">في يناير ألفين وخمسة عشر حاصر الحوثيون القصر الرئاسي، فقدّم هادي استقالته وفُرضت عليه الإقامة الجبرية.</w:t>
             </w:r>
           </w:p>
           <w:p>
@@ -5166,27 +5246,7 @@
                 <w:szCs w:val="26"/>
                 <w:rtl/>
               </w:rPr>
-              <w:t xml:space="preserve">وأصدر مجلس الأمن القرار ألفين ومئتين وستة عشر الذي طالب الحوثيين بالانسحاب من المدن وتسليم السلاح.</w:t>
-            </w:r>
-          </w:p>
-          <w:p>
-            <w:pPr>
-              <w:bidi/>
-              <w:spacing w:after="100" w:line="360"/>
-              <w:jc w:val="both"/>
-            </w:pPr>
-            <w:r>
-              <w:rPr>
-                <w:rFonts w:ascii="Arial" w:cs="Arial" w:eastAsia="Arial" w:hAnsi="Arial"/>
-                <w:b/>
-                <w:bCs/>
-                <w:i w:val="false"/>
-                <w:color w:val="1E1B16"/>
-                <w:sz w:val="26"/>
-                <w:szCs w:val="26"/>
-                <w:rtl/>
-              </w:rPr>
-              <w:t xml:space="preserve">واتهمت دول التحالف وواشنطن إيران بتسليح الجماعة، فيما تنفي طهران والحوثيون أن تكون العلاقة علاقة تبعية.</w:t>
+              <w:t xml:space="preserve">وفي فبراير أصدروا «إعلاناً دستورياً» حلّوا به البرلمان، لكن هادي فرّ إلى عدن وتراجع عن استقالته، فتقدم الحوثيون جنوباً نحوه.</w:t>
             </w:r>
           </w:p>
         </w:tc>
@@ -5200,42 +5260,6 @@
     </w:p>
     <w:p>
       <w:pPr>
-        <w:pStyle w:val="Heading1"/>
-        <w:keepNext/>
-        <w:pBdr>
-          <w:bottom w:val="single" w:color="C0392B" w:sz="12" w:space="6"/>
-        </w:pBdr>
-        <w:bidi/>
-        <w:spacing w:after="200" w:before="360"/>
-      </w:pPr>
-      <w:r>
-        <w:rPr>
-          <w:rFonts w:ascii="Arial" w:cs="Arial" w:eastAsia="Arial" w:hAnsi="Arial"/>
-          <w:b/>
-          <w:bCs/>
-          <w:i w:val="false"/>
-          <w:color w:val="C0392B"/>
-          <w:sz w:val="34"/>
-          <w:szCs w:val="34"/>
-          <w:rtl/>
-        </w:rPr>
-        <w:t xml:space="preserve">الفصل الثامن: الحليف الذي صار خصماً</w:t>
-      </w:r>
-      <w:r>
-        <w:rPr>
-          <w:rFonts w:ascii="Arial" w:cs="Arial" w:eastAsia="Arial" w:hAnsi="Arial"/>
-          <w:b w:val="false"/>
-          <w:i w:val="false"/>
-          <w:color w:val="6B6358"/>
-          <w:sz w:val="24"/>
-          <w:szCs w:val="24"/>
-          <w:rtl w:val="false"/>
-        </w:rPr>
-        <w:t xml:space="preserve">   6:00 – 6:35</w:t>
-      </w:r>
-    </w:p>
-    <w:p>
-      <w:pPr>
         <w:pStyle w:val="Heading2"/>
         <w:keepNext/>
         <w:bidi/>
@@ -5252,7 +5276,7 @@
           <w:szCs w:val="28"/>
           <w:rtl/>
         </w:rPr>
-        <w:t xml:space="preserve">المشهد 14: الشراكة وانهيارها</w:t>
+        <w:t xml:space="preserve">المشهد 14: عاصفة الحزم</w:t>
       </w:r>
     </w:p>
     <w:tbl>
@@ -5347,7 +5371,7 @@
                 <w:szCs w:val="23"/>
                 <w:rtl/>
               </w:rPr>
-              <w:t xml:space="preserve">يدان تتصافحان (صالح والحوثي)، ثم يظهر شعار «المجلس السياسي الأعلى». تتشقق المصافحة تدريجياً. تتحول الشاشة إلى لون رمادي ويظهر تاريخ 4 ديسمبر 2017 وحده.</w:t>
+              <w:t xml:space="preserve">ليل، أيقونات طائرات تعبر من الشمال، ووميض انفجارات صامتة على الخريطة. تظهر أعلام دول التحالف صفاً واحداً، ثم وثيقة القرار الأممي 2216.</w:t>
             </w:r>
           </w:p>
         </w:tc>
@@ -5426,7 +5450,7 @@
                 <w:szCs w:val="23"/>
                 <w:rtl/>
               </w:rPr>
-              <w:t xml:space="preserve">«2016: المجلس السياسي الأعلى» / «4 ديسمبر 2017: مقتل علي عبد الله صالح»</w:t>
+              <w:t xml:space="preserve">«26 مارس 2015: عاصفة الحزم» / «قرار مجلس الأمن 2216»</w:t>
             </w:r>
           </w:p>
         </w:tc>
@@ -5508,7 +5532,7 @@
                 <w:szCs w:val="26"/>
                 <w:rtl/>
               </w:rPr>
-              <w:t xml:space="preserve">عام ألفين وستة عشر شكّل الحوثيون وحزب صالح «المجلس السياسي الأعلى» لحكم المناطق الخاضعة لهما.</w:t>
+              <w:t xml:space="preserve">في السادس والعشرين من مارس ألفين وخمسة عشر، أطلقت السعودية على رأس تحالف عربي عملية «عاصفة الحزم» لإعادة حكومة هادي.</w:t>
             </w:r>
           </w:p>
           <w:p>
@@ -5528,7 +5552,7 @@
                 <w:szCs w:val="26"/>
                 <w:rtl/>
               </w:rPr>
-              <w:t xml:space="preserve">لكن الشراكة كانت قلقة. وفي ديسمبر ألفين وسبعة عشر أعلن صالح فك التحالف ودعا إلى فتح صفحة جديدة مع السعودية.</w:t>
+              <w:t xml:space="preserve">وأصدر مجلس الأمن القرار ألفين ومئتين وستة عشر الذي طالب الحوثيين بالانسحاب من المدن وتسليم السلاح.</w:t>
             </w:r>
           </w:p>
           <w:p>
@@ -5548,7 +5572,7 @@
                 <w:szCs w:val="26"/>
                 <w:rtl/>
               </w:rPr>
-              <w:t xml:space="preserve">بعد يومين، قُتل على يد الحوثيين، فانفردت الجماعة بحكم صنعاء.</w:t>
+              <w:t xml:space="preserve">واتهمت دول التحالف وواشنطن إيران بتسليح الجماعة، فيما تنفي طهران والحوثيون أن تكون العلاقة علاقة تبعية.</w:t>
             </w:r>
           </w:p>
         </w:tc>
@@ -5581,7 +5605,7 @@
           <w:szCs w:val="34"/>
           <w:rtl/>
         </w:rPr>
-        <w:t xml:space="preserve">الفصل التاسع: سنوات الاستنزاف</w:t>
+        <w:t xml:space="preserve">الفصل الثامن: الحليف الذي صار خصماً</w:t>
       </w:r>
       <w:r>
         <w:rPr>
@@ -5593,7 +5617,7 @@
           <w:szCs w:val="24"/>
           <w:rtl w:val="false"/>
         </w:rPr>
-        <w:t xml:space="preserve">   6:35 – 7:20</w:t>
+        <w:t xml:space="preserve">   6:45 – 7:20</w:t>
       </w:r>
     </w:p>
     <w:p>
@@ -5614,7 +5638,7 @@
           <w:szCs w:val="28"/>
           <w:rtl/>
         </w:rPr>
-        <w:t xml:space="preserve">المشهد 15: الحديدة والصواريخ ومأرب</w:t>
+        <w:t xml:space="preserve">المشهد 15: الشراكة وانهيارها</w:t>
       </w:r>
     </w:p>
     <w:tbl>
@@ -5709,7 +5733,7 @@
                 <w:szCs w:val="23"/>
                 <w:rtl/>
               </w:rPr>
-              <w:t xml:space="preserve">يتنقل المشهد بين ثلاث نقاط على الخريطة: ميناء الحديدة ومعه وثيقة «اتفاق ستوكهولم»، ثم سهم يعبر الحدود إلى منشأة نفطية في أبقيق، ثم مأرب وحولها خطوط جبهات متحركة.</w:t>
+              <w:t xml:space="preserve">يدان تتصافحان (صالح والحوثي)، ثم يظهر شعار «المجلس السياسي الأعلى». تتشقق المصافحة تدريجياً. تتحول الشاشة إلى لون رمادي ويظهر تاريخ 4 ديسمبر 2017 وحده.</w:t>
             </w:r>
           </w:p>
         </w:tc>
@@ -5788,7 +5812,7 @@
                 <w:szCs w:val="23"/>
                 <w:rtl/>
               </w:rPr>
-              <w:t xml:space="preserve">«2018: اتفاق ستوكهولم» / «2019: هجوم أبقيق وخريص» / «2021: معركة مأرب»</w:t>
+              <w:t xml:space="preserve">«2016: المجلس السياسي الأعلى» / «4 ديسمبر 2017: مقتل علي عبد الله صالح»</w:t>
             </w:r>
           </w:p>
         </w:tc>
@@ -5870,7 +5894,7 @@
                 <w:szCs w:val="26"/>
                 <w:rtl/>
               </w:rPr>
-              <w:t xml:space="preserve">تحولت الحرب إلى استنزاف طويل.</w:t>
+              <w:t xml:space="preserve">عام ألفين وستة عشر شكّل الحوثيون وحزب صالح «المجلس السياسي الأعلى» لحكم المناطق الخاضعة لهما.</w:t>
             </w:r>
           </w:p>
           <w:p>
@@ -5890,7 +5914,7 @@
                 <w:szCs w:val="26"/>
                 <w:rtl/>
               </w:rPr>
-              <w:t xml:space="preserve">عام ألفين وثمانية عشر اقتربت قوات الحكومة والتحالف من ميناء الحديدة، شريان الشمال، فأوقفها «اتفاق ستوكهولم».</w:t>
+              <w:t xml:space="preserve">لكن الشراكة كانت قلقة. وفي ديسمبر ألفين وسبعة عشر أعلن صالح فك التحالف ودعا إلى فتح صفحة جديدة مع السعودية.</w:t>
             </w:r>
           </w:p>
           <w:p>
@@ -5910,27 +5934,7 @@
                 <w:szCs w:val="26"/>
                 <w:rtl/>
               </w:rPr>
-              <w:t xml:space="preserve">وطوّر الحوثيون ترسانة من الصواريخ والطائرات المسيّرة وصلت إلى عمق السعودية. وفي سبتمبر ألفين وتسعة عشر تبنّوا هجوماً على منشأتي أبقيق وخريص النفطيتين، بينما حمّلت واشنطن والرياض إيران مسؤوليته.</w:t>
-            </w:r>
-          </w:p>
-          <w:p>
-            <w:pPr>
-              <w:bidi/>
-              <w:spacing w:after="100" w:line="360"/>
-              <w:jc w:val="both"/>
-            </w:pPr>
-            <w:r>
-              <w:rPr>
-                <w:rFonts w:ascii="Arial" w:cs="Arial" w:eastAsia="Arial" w:hAnsi="Arial"/>
-                <w:b/>
-                <w:bCs/>
-                <w:i w:val="false"/>
-                <w:color w:val="1E1B16"/>
-                <w:sz w:val="26"/>
-                <w:szCs w:val="26"/>
-                <w:rtl/>
-              </w:rPr>
-              <w:t xml:space="preserve">ثم ألقوا بثقلهم عام ألفين وواحد وعشرين على مأرب، آخر معاقل الحكومة الكبرى في الشمال، لكنها صمدت.</w:t>
+              <w:t xml:space="preserve">بعد يومين، قُتل على يد الحوثيين، فانفردت الجماعة بحكم صنعاء.</w:t>
             </w:r>
           </w:p>
         </w:tc>
@@ -5944,6 +5948,42 @@
     </w:p>
     <w:p>
       <w:pPr>
+        <w:pStyle w:val="Heading1"/>
+        <w:keepNext/>
+        <w:pBdr>
+          <w:bottom w:val="single" w:color="C0392B" w:sz="12" w:space="6"/>
+        </w:pBdr>
+        <w:bidi/>
+        <w:spacing w:after="200" w:before="360"/>
+      </w:pPr>
+      <w:r>
+        <w:rPr>
+          <w:rFonts w:ascii="Arial" w:cs="Arial" w:eastAsia="Arial" w:hAnsi="Arial"/>
+          <w:b/>
+          <w:bCs/>
+          <w:i w:val="false"/>
+          <w:color w:val="C0392B"/>
+          <w:sz w:val="34"/>
+          <w:szCs w:val="34"/>
+          <w:rtl/>
+        </w:rPr>
+        <w:t xml:space="preserve">الفصل التاسع: سنوات الاستنزاف</w:t>
+      </w:r>
+      <w:r>
+        <w:rPr>
+          <w:rFonts w:ascii="Arial" w:cs="Arial" w:eastAsia="Arial" w:hAnsi="Arial"/>
+          <w:b w:val="false"/>
+          <w:i w:val="false"/>
+          <w:color w:val="6B6358"/>
+          <w:sz w:val="24"/>
+          <w:szCs w:val="24"/>
+          <w:rtl w:val="false"/>
+        </w:rPr>
+        <w:t xml:space="preserve">   7:20 – 8:05</w:t>
+      </w:r>
+    </w:p>
+    <w:p>
+      <w:pPr>
         <w:pStyle w:val="Heading2"/>
         <w:keepNext/>
         <w:bidi/>
@@ -5960,7 +6000,7 @@
           <w:szCs w:val="28"/>
           <w:rtl/>
         </w:rPr>
-        <w:t xml:space="preserve">المشهد 16: الثمن الإنساني</w:t>
+        <w:t xml:space="preserve">المشهد 16: الحديدة والصواريخ ومأرب</w:t>
       </w:r>
     </w:p>
     <w:tbl>
@@ -6055,7 +6095,7 @@
                 <w:szCs w:val="23"/>
                 <w:rtl/>
               </w:rPr>
-              <w:t xml:space="preserve">يتباطأ الإيقاع وتخفت الموسيقى. أرقام بخط رفيع تظهر على خلفية خالية من الألوان. أيقونات بسيطة لخيمة ودلو ماء وكيس قمح.</w:t>
+              <w:t xml:space="preserve">يتنقل المشهد بين ثلاث نقاط على الخريطة: ميناء الحديدة ومعه وثيقة «اتفاق ستوكهولم»، ثم سهم يعبر الحدود إلى منشأة نفطية في أبقيق، ثم مأرب وحولها خطوط جبهات متحركة.</w:t>
             </w:r>
           </w:p>
         </w:tc>
@@ -6134,7 +6174,7 @@
                 <w:szCs w:val="23"/>
                 <w:rtl/>
               </w:rPr>
-              <w:t xml:space="preserve">«أكثر من 377 ألف وفاة حتى نهاية 2021 (تقدير الأمم المتحدة، بين مباشرة وغير مباشرة)»</w:t>
+              <w:t xml:space="preserve">«2018: اتفاق ستوكهولم» / «2019: هجوم أبقيق وخريص» / «2021: معركة مأرب»</w:t>
             </w:r>
           </w:p>
         </w:tc>
@@ -6216,7 +6256,7 @@
                 <w:szCs w:val="26"/>
                 <w:rtl/>
               </w:rPr>
-              <w:t xml:space="preserve">وفي خلفية كل ذلك، كان المدنيون يدفعون الثمن الأكبر.</w:t>
+              <w:t xml:space="preserve">تحولت الحرب إلى استنزاف طويل.</w:t>
             </w:r>
           </w:p>
           <w:p>
@@ -6236,7 +6276,47 @@
                 <w:szCs w:val="26"/>
                 <w:rtl/>
               </w:rPr>
-              <w:t xml:space="preserve">قدّرت الأمم المتحدة أن الحرب أودت بحياة أكثر من ثلاثمئة وسبعة وسبعين ألف شخص حتى نهاية ألفين وواحد وعشرين، معظمهم بسبب الجوع والمرض وانهيار الخدمات، ووصفت ما يحدث بأنه من أسوأ الأزمات الإنسانية في العالم.</w:t>
+              <w:t xml:space="preserve">عام ألفين وثمانية عشر اقتربت قوات الحكومة والتحالف من ميناء الحديدة، شريان الشمال، فأوقفها «اتفاق ستوكهولم».</w:t>
+            </w:r>
+          </w:p>
+          <w:p>
+            <w:pPr>
+              <w:bidi/>
+              <w:spacing w:after="100" w:line="360"/>
+              <w:jc w:val="both"/>
+            </w:pPr>
+            <w:r>
+              <w:rPr>
+                <w:rFonts w:ascii="Arial" w:cs="Arial" w:eastAsia="Arial" w:hAnsi="Arial"/>
+                <w:b/>
+                <w:bCs/>
+                <w:i w:val="false"/>
+                <w:color w:val="1E1B16"/>
+                <w:sz w:val="26"/>
+                <w:szCs w:val="26"/>
+                <w:rtl/>
+              </w:rPr>
+              <w:t xml:space="preserve">وطوّر الحوثيون ترسانة من الصواريخ والطائرات المسيّرة وصلت إلى عمق السعودية. وفي سبتمبر ألفين وتسعة عشر تبنّوا هجوماً على منشأتي أبقيق وخريص النفطيتين، بينما حمّلت واشنطن والرياض إيران مسؤوليته.</w:t>
+            </w:r>
+          </w:p>
+          <w:p>
+            <w:pPr>
+              <w:bidi/>
+              <w:spacing w:after="100" w:line="360"/>
+              <w:jc w:val="both"/>
+            </w:pPr>
+            <w:r>
+              <w:rPr>
+                <w:rFonts w:ascii="Arial" w:cs="Arial" w:eastAsia="Arial" w:hAnsi="Arial"/>
+                <w:b/>
+                <w:bCs/>
+                <w:i w:val="false"/>
+                <w:color w:val="1E1B16"/>
+                <w:sz w:val="26"/>
+                <w:szCs w:val="26"/>
+                <w:rtl/>
+              </w:rPr>
+              <w:t xml:space="preserve">ثم ألقوا بثقلهم عام ألفين وواحد وعشرين على مأرب، آخر معاقل الحكومة الكبرى في الشمال، لكنها صمدت.</w:t>
             </w:r>
           </w:p>
         </w:tc>
@@ -6250,42 +6330,6 @@
     </w:p>
     <w:p>
       <w:pPr>
-        <w:pStyle w:val="Heading1"/>
-        <w:keepNext/>
-        <w:pBdr>
-          <w:bottom w:val="single" w:color="C0392B" w:sz="12" w:space="6"/>
-        </w:pBdr>
-        <w:bidi/>
-        <w:spacing w:after="200" w:before="360"/>
-      </w:pPr>
-      <w:r>
-        <w:rPr>
-          <w:rFonts w:ascii="Arial" w:cs="Arial" w:eastAsia="Arial" w:hAnsi="Arial"/>
-          <w:b/>
-          <w:bCs/>
-          <w:i w:val="false"/>
-          <w:color w:val="C0392B"/>
-          <w:sz w:val="34"/>
-          <w:szCs w:val="34"/>
-          <w:rtl/>
-        </w:rPr>
-        <w:t xml:space="preserve">الفصل العاشر: هدنة بلا سلام</w:t>
-      </w:r>
-      <w:r>
-        <w:rPr>
-          <w:rFonts w:ascii="Arial" w:cs="Arial" w:eastAsia="Arial" w:hAnsi="Arial"/>
-          <w:b w:val="false"/>
-          <w:i w:val="false"/>
-          <w:color w:val="6B6358"/>
-          <w:sz w:val="24"/>
-          <w:szCs w:val="24"/>
-          <w:rtl w:val="false"/>
-        </w:rPr>
-        <w:t xml:space="preserve">   7:20 – 7:45</w:t>
-      </w:r>
-    </w:p>
-    <w:p>
-      <w:pPr>
         <w:pStyle w:val="Heading2"/>
         <w:keepNext/>
         <w:bidi/>
@@ -6302,7 +6346,7 @@
           <w:szCs w:val="28"/>
           <w:rtl/>
         </w:rPr>
-        <w:t xml:space="preserve">المشهد 17: الهدنة</w:t>
+        <w:t xml:space="preserve">المشهد 17: الثمن الإنساني</w:t>
       </w:r>
     </w:p>
     <w:tbl>
@@ -6397,7 +6441,7 @@
                 <w:szCs w:val="23"/>
                 <w:rtl/>
               </w:rPr>
-              <w:t xml:space="preserve">الأسهم الحمراء تتوقف وتبهت. حمامة بخط بسيط تظهر ثم تبقى معلقة. وفد يصل إلى صنعاء، وطائرة تحمل أسرى في تبادل.</w:t>
+              <w:t xml:space="preserve">يتباطأ الإيقاع وتخفت الموسيقى. أرقام بخط رفيع تظهر على خلفية خالية من الألوان. أيقونات بسيطة لخيمة ودلو ماء وكيس قمح.</w:t>
             </w:r>
           </w:p>
         </w:tc>
@@ -6476,7 +6520,7 @@
                 <w:szCs w:val="23"/>
                 <w:rtl/>
               </w:rPr>
-              <w:t xml:space="preserve">«أبريل 2022: الهدنة الأممية ومجلس القيادة الرئاسي» / «2023: محادثات سعودية حوثية»</w:t>
+              <w:t xml:space="preserve">«أكثر من 377 ألف وفاة حتى نهاية 2021 (تقدير الأمم المتحدة، بين مباشرة وغير مباشرة)»</w:t>
             </w:r>
           </w:p>
         </w:tc>
@@ -6558,7 +6602,7 @@
                 <w:szCs w:val="26"/>
                 <w:rtl/>
               </w:rPr>
-              <w:t xml:space="preserve">في أبريل ألفين واثنين وعشرين أعلنت الأمم المتحدة هدنة، ونقل هادي صلاحياته إلى «مجلس القيادة الرئاسي».</w:t>
+              <w:t xml:space="preserve">وفي خلفية كل ذلك، كان المدنيون يدفعون الثمن الأكبر.</w:t>
             </w:r>
           </w:p>
           <w:p>
@@ -6578,27 +6622,7 @@
                 <w:szCs w:val="26"/>
                 <w:rtl/>
               </w:rPr>
-              <w:t xml:space="preserve">انتهت الهدنة رسمياً بعد ستة أشهر، لكن الجبهات بقيت هادئة إلى حد كبير، وجرت محادثات مباشرة بين الرياض والحوثيين، وتبادل الطرفان مئات الأسرى.</w:t>
-            </w:r>
-          </w:p>
-          <w:p>
-            <w:pPr>
-              <w:bidi/>
-              <w:spacing w:after="100" w:line="360"/>
-              <w:jc w:val="both"/>
-            </w:pPr>
-            <w:r>
-              <w:rPr>
-                <w:rFonts w:ascii="Arial" w:cs="Arial" w:eastAsia="Arial" w:hAnsi="Arial"/>
-                <w:b/>
-                <w:bCs/>
-                <w:i w:val="false"/>
-                <w:color w:val="1E1B16"/>
-                <w:sz w:val="26"/>
-                <w:szCs w:val="26"/>
-                <w:rtl/>
-              </w:rPr>
-              <w:t xml:space="preserve">بدا أن السلام قريب، ثم تغير كل شيء.</w:t>
+              <w:t xml:space="preserve">قدّرت الأمم المتحدة أن الحرب أودت بحياة أكثر من ثلاثمئة وسبعة وسبعين ألف شخص حتى نهاية ألفين وواحد وعشرين، معظمهم بسبب الجوع والمرض وانهيار الخدمات، ووصفت ما يحدث بأنه من أسوأ الأزمات الإنسانية في العالم.</w:t>
             </w:r>
           </w:p>
         </w:tc>
@@ -6631,7 +6655,7 @@
           <w:szCs w:val="34"/>
           <w:rtl/>
         </w:rPr>
-        <w:t xml:space="preserve">الفصل الحادي عشر: البحر الأحمر</w:t>
+        <w:t xml:space="preserve">الفصل العاشر: هدنة بلا سلام</w:t>
       </w:r>
       <w:r>
         <w:rPr>
@@ -6643,7 +6667,7 @@
           <w:szCs w:val="24"/>
           <w:rtl w:val="false"/>
         </w:rPr>
-        <w:t xml:space="preserve">   7:45 – 8:40</w:t>
+        <w:t xml:space="preserve">   8:05 – 8:30</w:t>
       </w:r>
     </w:p>
     <w:p>
@@ -6664,7 +6688,7 @@
           <w:szCs w:val="28"/>
           <w:rtl/>
         </w:rPr>
-        <w:t xml:space="preserve">المشهد 18: غزة وباب المندب</w:t>
+        <w:t xml:space="preserve">المشهد 18: الهدنة</w:t>
       </w:r>
     </w:p>
     <w:tbl>
@@ -6759,7 +6783,7 @@
                 <w:szCs w:val="23"/>
                 <w:rtl/>
               </w:rPr>
-              <w:t xml:space="preserve">تبتعد الكاميرا من اليمن إلى خريطة إقليمية. يضيء مضيق باب المندب. سفينة «غالاكسي ليدر» ومروحية فوقها. خطوط الملاحة تنحرف بعيداً عن البحر الأحمر لتدور حول رأس الرجاء الصالح.</w:t>
+              <w:t xml:space="preserve">الأسهم الحمراء تتوقف وتبهت. حمامة بخط بسيط تظهر ثم تبقى معلقة. وفد يصل إلى صنعاء، وطائرة تحمل أسرى في تبادل.</w:t>
             </w:r>
           </w:p>
         </w:tc>
@@ -6838,7 +6862,7 @@
                 <w:szCs w:val="23"/>
                 <w:rtl/>
               </w:rPr>
-              <w:t xml:space="preserve">«أكتوبر 2023: حرب غزة» / «نوفمبر 2023: احتجاز غالاكسي ليدر»</w:t>
+              <w:t xml:space="preserve">«أبريل 2022: الهدنة الأممية ومجلس القيادة الرئاسي» / «2023: محادثات سعودية حوثية»</w:t>
             </w:r>
           </w:p>
         </w:tc>
@@ -6920,7 +6944,7 @@
                 <w:szCs w:val="26"/>
                 <w:rtl/>
               </w:rPr>
-              <w:t xml:space="preserve">بعد اندلاع حرب غزة في أكتوبر ألفين وثلاثة وعشرين، أعلن الحوثيون دخولهم المواجهة دعماً للفلسطينيين.</w:t>
+              <w:t xml:space="preserve">في أبريل ألفين واثنين وعشرين أعلنت الأمم المتحدة هدنة، ونقل هادي صلاحياته إلى «مجلس القيادة الرئاسي».</w:t>
             </w:r>
           </w:p>
           <w:p>
@@ -6940,7 +6964,7 @@
                 <w:szCs w:val="26"/>
                 <w:rtl/>
               </w:rPr>
-              <w:t xml:space="preserve">أطلقوا الصواريخ والمسيّرات نحو إسرائيل، واستولوا على سفينة الشحن «غالاكسي ليدر»، ثم بدأوا مهاجمة السفن في البحر الأحمر وخليج عدن.</w:t>
+              <w:t xml:space="preserve">انتهت الهدنة رسمياً بعد ستة أشهر، لكن الجبهات بقيت هادئة إلى حد كبير، وجرت محادثات مباشرة بين الرياض والحوثيين، وتبادل الطرفان مئات الأسرى.</w:t>
             </w:r>
           </w:p>
           <w:p>
@@ -6960,7 +6984,7 @@
                 <w:szCs w:val="26"/>
                 <w:rtl/>
               </w:rPr>
-              <w:t xml:space="preserve">اضطرت كبرى شركات الشحن إلى تغيير مساراتها حول أفريقيا، وتراجعت حركة المرور في قناة السويس بشكل حاد.</w:t>
+              <w:t xml:space="preserve">بدا أن السلام قريب، ثم تغير كل شيء.</w:t>
             </w:r>
           </w:p>
         </w:tc>
@@ -6974,6 +6998,42 @@
     </w:p>
     <w:p>
       <w:pPr>
+        <w:pStyle w:val="Heading1"/>
+        <w:keepNext/>
+        <w:pBdr>
+          <w:bottom w:val="single" w:color="C0392B" w:sz="12" w:space="6"/>
+        </w:pBdr>
+        <w:bidi/>
+        <w:spacing w:after="200" w:before="360"/>
+      </w:pPr>
+      <w:r>
+        <w:rPr>
+          <w:rFonts w:ascii="Arial" w:cs="Arial" w:eastAsia="Arial" w:hAnsi="Arial"/>
+          <w:b/>
+          <w:bCs/>
+          <w:i w:val="false"/>
+          <w:color w:val="C0392B"/>
+          <w:sz w:val="34"/>
+          <w:szCs w:val="34"/>
+          <w:rtl/>
+        </w:rPr>
+        <w:t xml:space="preserve">الفصل الحادي عشر: البحر الأحمر</w:t>
+      </w:r>
+      <w:r>
+        <w:rPr>
+          <w:rFonts w:ascii="Arial" w:cs="Arial" w:eastAsia="Arial" w:hAnsi="Arial"/>
+          <w:b w:val="false"/>
+          <w:i w:val="false"/>
+          <w:color w:val="6B6358"/>
+          <w:sz w:val="24"/>
+          <w:szCs w:val="24"/>
+          <w:rtl w:val="false"/>
+        </w:rPr>
+        <w:t xml:space="preserve">   8:30 – 9:25</w:t>
+      </w:r>
+    </w:p>
+    <w:p>
+      <w:pPr>
         <w:pStyle w:val="Heading2"/>
         <w:keepNext/>
         <w:bidi/>
@@ -6990,7 +7050,7 @@
           <w:szCs w:val="28"/>
           <w:rtl/>
         </w:rPr>
-        <w:t xml:space="preserve">المشهد 19: الضربات المتبادلة</w:t>
+        <w:t xml:space="preserve">المشهد 19: غزة وباب المندب</w:t>
       </w:r>
     </w:p>
     <w:tbl>
@@ -7085,7 +7145,7 @@
                 <w:szCs w:val="23"/>
                 <w:rtl/>
               </w:rPr>
-              <w:t xml:space="preserve">إيقاع سريع. أعلام الولايات المتحدة وبريطانيا ثم إسرائيل تظهر مع نبضات انفجار على الحديدة وصنعاء. في المقابل أسهم من اليمن نحو تل أبيب. عناوين أخبار متتالية تمر كشريط.</w:t>
+              <w:t xml:space="preserve">تبتعد الكاميرا من اليمن إلى خريطة إقليمية. يضيء مضيق باب المندب. سفينة «غالاكسي ليدر» ومروحية فوقها. خطوط الملاحة تنحرف بعيداً عن البحر الأحمر لتدور حول رأس الرجاء الصالح.</w:t>
             </w:r>
           </w:p>
         </w:tc>
@@ -7164,7 +7224,7 @@
                 <w:szCs w:val="23"/>
                 <w:rtl/>
               </w:rPr>
-              <w:t xml:space="preserve">«يناير 2024: ضربات أمريكية بريطانية» / «يوليو 2024: مسيّرة على تل أبيب وأول غارة إسرائيلية على الحديدة» / «مايو 2025: تهدئة أمريكية حوثية بوساطة عُمانية» / «أغسطس 2025: مقتل رئيس حكومة الحوثيين في غارة إسرائيلية»</w:t>
+              <w:t xml:space="preserve">«أكتوبر 2023: حرب غزة» / «نوفمبر 2023: احتجاز غالاكسي ليدر»</w:t>
             </w:r>
           </w:p>
         </w:tc>
@@ -7246,7 +7306,7 @@
                 <w:szCs w:val="26"/>
                 <w:rtl/>
               </w:rPr>
-              <w:t xml:space="preserve">ردّت الولايات المتحدة وبريطانيا بضربات على مواقع الجماعة منذ يناير ألفين وأربعة وعشرين، وأعادت واشنطن تصنيفها منظمة إرهابية.</w:t>
+              <w:t xml:space="preserve">بعد اندلاع حرب غزة في أكتوبر ألفين وثلاثة وعشرين، أعلن الحوثيون دخولهم المواجهة دعماً للفلسطينيين.</w:t>
             </w:r>
           </w:p>
           <w:p>
@@ -7266,7 +7326,7 @@
                 <w:szCs w:val="26"/>
                 <w:rtl/>
               </w:rPr>
-              <w:t xml:space="preserve">وفي يوليو من العام نفسه وصلت مسيّرة حوثية إلى تل أبيب، فردّت إسرائيل بأول غاراتها على ميناء الحديدة.</w:t>
+              <w:t xml:space="preserve">أطلقوا الصواريخ والمسيّرات نحو إسرائيل، واستولوا على سفينة الشحن «غالاكسي ليدر»، ثم بدأوا مهاجمة السفن في البحر الأحمر وخليج عدن.</w:t>
             </w:r>
           </w:p>
           <w:p>
@@ -7286,27 +7346,7 @@
                 <w:szCs w:val="26"/>
                 <w:rtl/>
               </w:rPr>
-              <w:t xml:space="preserve">عام ألفين وخمسة وعشرين شنّت واشنطن حملة جوية واسعة انتهت بتهدئة بوساطة عُمانية، لكن المواجهة مع إسرائيل استمرت، وقُتل في إحدى غاراتها رئيس حكومة الحوثيين وعدد من وزرائه.</w:t>
-            </w:r>
-          </w:p>
-          <w:p>
-            <w:pPr>
-              <w:bidi/>
-              <w:spacing w:after="100" w:line="360"/>
-              <w:jc w:val="both"/>
-            </w:pPr>
-            <w:r>
-              <w:rPr>
-                <w:rFonts w:ascii="Arial" w:cs="Arial" w:eastAsia="Arial" w:hAnsi="Arial"/>
-                <w:b/>
-                <w:bCs/>
-                <w:i w:val="false"/>
-                <w:color w:val="1E1B16"/>
-                <w:sz w:val="26"/>
-                <w:szCs w:val="26"/>
-                <w:rtl/>
-              </w:rPr>
-              <w:t xml:space="preserve">ومع وقف إطلاق النار في غزة في أكتوبر ألفين وخمسة وعشرين، خفتت الجبهة البحرية، دون أن تنتهي الأسئلة.</w:t>
+              <w:t xml:space="preserve">اضطرت كبرى شركات الشحن إلى تغيير مساراتها حول أفريقيا، وتراجعت حركة المرور في قناة السويس بشكل حاد.</w:t>
             </w:r>
           </w:p>
         </w:tc>
@@ -7320,42 +7360,6 @@
     </w:p>
     <w:p>
       <w:pPr>
-        <w:pStyle w:val="Heading1"/>
-        <w:keepNext/>
-        <w:pBdr>
-          <w:bottom w:val="single" w:color="C0392B" w:sz="12" w:space="6"/>
-        </w:pBdr>
-        <w:bidi/>
-        <w:spacing w:after="200" w:before="360"/>
-      </w:pPr>
-      <w:r>
-        <w:rPr>
-          <w:rFonts w:ascii="Arial" w:cs="Arial" w:eastAsia="Arial" w:hAnsi="Arial"/>
-          <w:b/>
-          <w:bCs/>
-          <w:i w:val="false"/>
-          <w:color w:val="C0392B"/>
-          <w:sz w:val="34"/>
-          <w:szCs w:val="34"/>
-          <w:rtl/>
-        </w:rPr>
-        <w:t xml:space="preserve">الخاتمة</w:t>
-      </w:r>
-      <w:r>
-        <w:rPr>
-          <w:rFonts w:ascii="Arial" w:cs="Arial" w:eastAsia="Arial" w:hAnsi="Arial"/>
-          <w:b w:val="false"/>
-          <w:i w:val="false"/>
-          <w:color w:val="6B6358"/>
-          <w:sz w:val="24"/>
-          <w:szCs w:val="24"/>
-          <w:rtl w:val="false"/>
-        </w:rPr>
-        <w:t xml:space="preserve">   8:40 – 9:10</w:t>
-      </w:r>
-    </w:p>
-    <w:p>
-      <w:pPr>
         <w:pStyle w:val="Heading2"/>
         <w:keepNext/>
         <w:bidi/>
@@ -7372,7 +7376,7 @@
           <w:szCs w:val="28"/>
           <w:rtl/>
         </w:rPr>
-        <w:t xml:space="preserve">المشهد 20: إلى أين؟</w:t>
+        <w:t xml:space="preserve">المشهد 20: الضربات المتبادلة</w:t>
       </w:r>
     </w:p>
     <w:tbl>
@@ -7467,7 +7471,7 @@
                 <w:szCs w:val="23"/>
                 <w:rtl/>
               </w:rPr>
-              <w:t xml:space="preserve">نعود إلى نقطة الضوء الأولى في صعدة. تبتعد الكاميرا ببطء فيظهر اليمن مقسماً بألوان مناطق السيطرة، ثم البحر الأحمر. يكتمل الخط الزمني من 897 إلى 2025 ويبقى طرفه الأيمن مفتوحاً بثلاث نقاط.</w:t>
+              <w:t xml:space="preserve">إيقاع سريع. أعلام الولايات المتحدة وبريطانيا ثم إسرائيل تظهر مع نبضات انفجار على الحديدة وصنعاء. في المقابل أسهم من اليمن نحو تل أبيب. عناوين أخبار متتالية تمر كشريط.</w:t>
             </w:r>
           </w:p>
         </w:tc>
@@ -7546,7 +7550,7 @@
                 <w:szCs w:val="23"/>
                 <w:rtl/>
               </w:rPr>
-              <w:t xml:space="preserve">«897 ←→ 2025 …» / ثم عنوان الفيديو</w:t>
+              <w:t xml:space="preserve">«يناير 2024: ضربات أمريكية بريطانية» / «يوليو 2024: مسيّرة على تل أبيب وأول غارة إسرائيلية على الحديدة» / «مايو 2025: تهدئة أمريكية حوثية بوساطة عُمانية» / «أغسطس 2025: مقتل رئيس حكومة الحوثيين في غارة إسرائيلية»</w:t>
             </w:r>
           </w:p>
         </w:tc>
@@ -7628,7 +7632,7 @@
                 <w:szCs w:val="26"/>
                 <w:rtl/>
               </w:rPr>
-              <w:t xml:space="preserve">من محاضرات في مسجد بجبال صعدة، إلى سلطة تحكم معظم سكان اليمن وتتحدى قوى إقليمية ودولية.</w:t>
+              <w:t xml:space="preserve">ردّت الولايات المتحدة وبريطانيا بضربات على مواقع الجماعة منذ يناير ألفين وأربعة وعشرين، وأعادت واشنطن تصنيفها منظمة إرهابية.</w:t>
             </w:r>
           </w:p>
           <w:p>
@@ -7648,7 +7652,7 @@
                 <w:szCs w:val="26"/>
                 <w:rtl/>
               </w:rPr>
-              <w:t xml:space="preserve">قصة الحوثيين هي قصة هوية شعرت بالتهديد، ودولة ضعيفة، وتحالفات تتبدل، وحرب لم تُحسم بعد.</w:t>
+              <w:t xml:space="preserve">وفي يوليو من العام نفسه وصلت مسيّرة حوثية إلى تل أبيب، فردّت إسرائيل بأول غاراتها على ميناء الحديدة.</w:t>
             </w:r>
           </w:p>
           <w:p>
@@ -7668,7 +7672,27 @@
                 <w:szCs w:val="26"/>
                 <w:rtl/>
               </w:rPr>
-              <w:t xml:space="preserve">أما الفصل الأخير من هذه القصة، فلم يُكتب حتى الآن.</w:t>
+              <w:t xml:space="preserve">عام ألفين وخمسة وعشرين شنّت واشنطن حملة جوية واسعة انتهت بتهدئة بوساطة عُمانية، لكن المواجهة مع إسرائيل استمرت، وقُتل في إحدى غاراتها رئيس حكومة الحوثيين وعدد من وزرائه.</w:t>
+            </w:r>
+          </w:p>
+          <w:p>
+            <w:pPr>
+              <w:bidi/>
+              <w:spacing w:after="100" w:line="360"/>
+              <w:jc w:val="both"/>
+            </w:pPr>
+            <w:r>
+              <w:rPr>
+                <w:rFonts w:ascii="Arial" w:cs="Arial" w:eastAsia="Arial" w:hAnsi="Arial"/>
+                <w:b/>
+                <w:bCs/>
+                <w:i w:val="false"/>
+                <w:color w:val="1E1B16"/>
+                <w:sz w:val="26"/>
+                <w:szCs w:val="26"/>
+                <w:rtl/>
+              </w:rPr>
+              <w:t xml:space="preserve">ومع وقف إطلاق النار في غزة في أكتوبر ألفين وخمسة وعشرين، خفتت الجبهة البحرية، دون أن تنتهي الأسئلة.</w:t>
             </w:r>
           </w:p>
         </w:tc>
@@ -7701,6 +7725,368 @@
           <w:szCs w:val="34"/>
           <w:rtl/>
         </w:rPr>
+        <w:t xml:space="preserve">الخاتمة</w:t>
+      </w:r>
+      <w:r>
+        <w:rPr>
+          <w:rFonts w:ascii="Arial" w:cs="Arial" w:eastAsia="Arial" w:hAnsi="Arial"/>
+          <w:b w:val="false"/>
+          <w:i w:val="false"/>
+          <w:color w:val="6B6358"/>
+          <w:sz w:val="24"/>
+          <w:szCs w:val="24"/>
+          <w:rtl w:val="false"/>
+        </w:rPr>
+        <w:t xml:space="preserve">   9:25 – 9:55</w:t>
+      </w:r>
+    </w:p>
+    <w:p>
+      <w:pPr>
+        <w:pStyle w:val="Heading2"/>
+        <w:keepNext/>
+        <w:bidi/>
+        <w:spacing w:after="120" w:before="200"/>
+      </w:pPr>
+      <w:r>
+        <w:rPr>
+          <w:rFonts w:ascii="Arial" w:cs="Arial" w:eastAsia="Arial" w:hAnsi="Arial"/>
+          <w:b/>
+          <w:bCs/>
+          <w:i w:val="false"/>
+          <w:color w:val="1E1B16"/>
+          <w:sz w:val="28"/>
+          <w:szCs w:val="28"/>
+          <w:rtl/>
+        </w:rPr>
+        <w:t xml:space="preserve">المشهد 21: إلى أين؟</w:t>
+      </w:r>
+    </w:p>
+    <w:tbl>
+      <w:tblPr>
+        <w:bidiVisual/>
+        <w:tblW w:type="dxa" w:w="9306"/>
+        <w:tblBorders>
+          <w:top w:val="single" w:color="auto" w:sz="4"/>
+          <w:left w:val="single" w:color="auto" w:sz="4"/>
+          <w:bottom w:val="single" w:color="auto" w:sz="4"/>
+          <w:right w:val="single" w:color="auto" w:sz="4"/>
+          <w:insideH w:val="single" w:color="auto" w:sz="4"/>
+          <w:insideV w:val="single" w:color="auto" w:sz="4"/>
+        </w:tblBorders>
+        <w:tblLayout w:type="fixed"/>
+      </w:tblPr>
+      <w:tblGrid>
+        <w:gridCol w:w="2100"/>
+        <w:gridCol w:w="7206"/>
+      </w:tblGrid>
+      <w:tr>
+        <w:trPr>
+          <w:cantSplit/>
+        </w:trPr>
+        <w:tc>
+          <w:tcPr>
+            <w:tcW w:type="dxa" w:w="2100"/>
+            <w:tcBorders>
+              <w:top w:val="single" w:color="D5CAB8" w:sz="4"/>
+              <w:left w:val="single" w:color="D5CAB8" w:sz="4"/>
+              <w:bottom w:val="single" w:color="D5CAB8" w:sz="4"/>
+              <w:right w:val="single" w:color="D5CAB8" w:sz="4"/>
+            </w:tcBorders>
+            <w:shd w:fill="F4EEE4" w:color="auto" w:val="clear"/>
+            <w:tcMar>
+              <w:top w:type="dxa" w:w="100"/>
+              <w:left w:type="dxa" w:w="140"/>
+              <w:bottom w:type="dxa" w:w="100"/>
+              <w:right w:type="dxa" w:w="140"/>
+            </w:tcMar>
+            <w:vAlign w:val="top"/>
+          </w:tcPr>
+          <w:p>
+            <w:pPr>
+              <w:bidi/>
+              <w:spacing w:after="0"/>
+            </w:pPr>
+            <w:r>
+              <w:rPr>
+                <w:rFonts w:ascii="Arial" w:cs="Arial" w:eastAsia="Arial" w:hAnsi="Arial"/>
+                <w:b/>
+                <w:bCs/>
+                <w:i w:val="false"/>
+                <w:color w:val="1F5F8B"/>
+                <w:sz w:val="22"/>
+                <w:szCs w:val="22"/>
+                <w:rtl/>
+              </w:rPr>
+              <w:t xml:space="preserve">المشهد البصري</w:t>
+            </w:r>
+          </w:p>
+        </w:tc>
+        <w:tc>
+          <w:tcPr>
+            <w:tcW w:type="dxa" w:w="7206"/>
+            <w:tcBorders>
+              <w:top w:val="single" w:color="D5CAB8" w:sz="4"/>
+              <w:left w:val="single" w:color="D5CAB8" w:sz="4"/>
+              <w:bottom w:val="single" w:color="D5CAB8" w:sz="4"/>
+              <w:right w:val="single" w:color="D5CAB8" w:sz="4"/>
+            </w:tcBorders>
+            <w:tcMar>
+              <w:top w:type="dxa" w:w="100"/>
+              <w:left w:type="dxa" w:w="140"/>
+              <w:bottom w:type="dxa" w:w="100"/>
+              <w:right w:type="dxa" w:w="140"/>
+            </w:tcMar>
+            <w:vAlign w:val="top"/>
+          </w:tcPr>
+          <w:p>
+            <w:pPr>
+              <w:bidi/>
+              <w:spacing w:after="0" w:line="300"/>
+            </w:pPr>
+            <w:r>
+              <w:rPr>
+                <w:rFonts w:ascii="Arial" w:cs="Arial" w:eastAsia="Arial" w:hAnsi="Arial"/>
+                <w:b w:val="false"/>
+                <w:i w:val="false"/>
+                <w:color w:val="1E1B16"/>
+                <w:sz w:val="23"/>
+                <w:szCs w:val="23"/>
+                <w:rtl/>
+              </w:rPr>
+              <w:t xml:space="preserve">نعود إلى نقطة الضوء الأولى في صعدة. تبتعد الكاميرا ببطء فيظهر اليمن مقسماً بألوان مناطق السيطرة، ثم البحر الأحمر. يكتمل الخط الزمني من 897 إلى 2025 ويبقى طرفه الأيمن مفتوحاً بثلاث نقاط.</w:t>
+            </w:r>
+          </w:p>
+        </w:tc>
+      </w:tr>
+      <w:tr>
+        <w:trPr>
+          <w:cantSplit/>
+        </w:trPr>
+        <w:tc>
+          <w:tcPr>
+            <w:tcW w:type="dxa" w:w="2100"/>
+            <w:tcBorders>
+              <w:top w:val="single" w:color="D5CAB8" w:sz="4"/>
+              <w:left w:val="single" w:color="D5CAB8" w:sz="4"/>
+              <w:bottom w:val="single" w:color="D5CAB8" w:sz="4"/>
+              <w:right w:val="single" w:color="D5CAB8" w:sz="4"/>
+            </w:tcBorders>
+            <w:shd w:fill="F4EEE4" w:color="auto" w:val="clear"/>
+            <w:tcMar>
+              <w:top w:type="dxa" w:w="100"/>
+              <w:left w:type="dxa" w:w="140"/>
+              <w:bottom w:type="dxa" w:w="100"/>
+              <w:right w:type="dxa" w:w="140"/>
+            </w:tcMar>
+            <w:vAlign w:val="top"/>
+          </w:tcPr>
+          <w:p>
+            <w:pPr>
+              <w:bidi/>
+              <w:spacing w:after="0"/>
+            </w:pPr>
+            <w:r>
+              <w:rPr>
+                <w:rFonts w:ascii="Arial" w:cs="Arial" w:eastAsia="Arial" w:hAnsi="Arial"/>
+                <w:b/>
+                <w:bCs/>
+                <w:i w:val="false"/>
+                <w:color w:val="6B7F3A"/>
+                <w:sz w:val="22"/>
+                <w:szCs w:val="22"/>
+                <w:rtl/>
+              </w:rPr>
+              <w:t xml:space="preserve">النص على الشاشة</w:t>
+            </w:r>
+          </w:p>
+        </w:tc>
+        <w:tc>
+          <w:tcPr>
+            <w:tcW w:type="dxa" w:w="7206"/>
+            <w:tcBorders>
+              <w:top w:val="single" w:color="D5CAB8" w:sz="4"/>
+              <w:left w:val="single" w:color="D5CAB8" w:sz="4"/>
+              <w:bottom w:val="single" w:color="D5CAB8" w:sz="4"/>
+              <w:right w:val="single" w:color="D5CAB8" w:sz="4"/>
+            </w:tcBorders>
+            <w:tcMar>
+              <w:top w:type="dxa" w:w="100"/>
+              <w:left w:type="dxa" w:w="140"/>
+              <w:bottom w:type="dxa" w:w="100"/>
+              <w:right w:type="dxa" w:w="140"/>
+            </w:tcMar>
+            <w:vAlign w:val="top"/>
+          </w:tcPr>
+          <w:p>
+            <w:pPr>
+              <w:bidi/>
+              <w:spacing w:after="0" w:line="300"/>
+            </w:pPr>
+            <w:r>
+              <w:rPr>
+                <w:rFonts w:ascii="Arial" w:cs="Arial" w:eastAsia="Arial" w:hAnsi="Arial"/>
+                <w:b w:val="false"/>
+                <w:i w:val="false"/>
+                <w:color w:val="1E1B16"/>
+                <w:sz w:val="23"/>
+                <w:szCs w:val="23"/>
+                <w:rtl/>
+              </w:rPr>
+              <w:t xml:space="preserve">«897 ←→ 2025 …» / ثم عنوان الفيديو</w:t>
+            </w:r>
+          </w:p>
+        </w:tc>
+      </w:tr>
+      <w:tr>
+        <w:trPr>
+          <w:cantSplit/>
+        </w:trPr>
+        <w:tc>
+          <w:tcPr>
+            <w:tcW w:type="dxa" w:w="2100"/>
+            <w:tcBorders>
+              <w:top w:val="single" w:color="D5CAB8" w:sz="4"/>
+              <w:left w:val="single" w:color="D5CAB8" w:sz="4"/>
+              <w:bottom w:val="single" w:color="D5CAB8" w:sz="4"/>
+              <w:right w:val="single" w:color="D5CAB8" w:sz="4"/>
+            </w:tcBorders>
+            <w:shd w:fill="F4EEE4" w:color="auto" w:val="clear"/>
+            <w:tcMar>
+              <w:top w:type="dxa" w:w="100"/>
+              <w:left w:type="dxa" w:w="140"/>
+              <w:bottom w:type="dxa" w:w="100"/>
+              <w:right w:type="dxa" w:w="140"/>
+            </w:tcMar>
+            <w:vAlign w:val="top"/>
+          </w:tcPr>
+          <w:p>
+            <w:pPr>
+              <w:bidi/>
+              <w:spacing w:after="0"/>
+            </w:pPr>
+            <w:r>
+              <w:rPr>
+                <w:rFonts w:ascii="Arial" w:cs="Arial" w:eastAsia="Arial" w:hAnsi="Arial"/>
+                <w:b/>
+                <w:bCs/>
+                <w:i w:val="false"/>
+                <w:color w:val="C0392B"/>
+                <w:sz w:val="22"/>
+                <w:szCs w:val="22"/>
+                <w:rtl/>
+              </w:rPr>
+              <w:t xml:space="preserve">التعليق الصوتي</w:t>
+            </w:r>
+          </w:p>
+        </w:tc>
+        <w:tc>
+          <w:tcPr>
+            <w:tcW w:type="dxa" w:w="7206"/>
+            <w:tcBorders>
+              <w:top w:val="single" w:color="D5CAB8" w:sz="4"/>
+              <w:left w:val="single" w:color="D5CAB8" w:sz="4"/>
+              <w:bottom w:val="single" w:color="D5CAB8" w:sz="4"/>
+              <w:right w:val="single" w:color="D5CAB8" w:sz="4"/>
+            </w:tcBorders>
+            <w:shd w:fill="FBF7F0" w:color="auto" w:val="clear"/>
+            <w:tcMar>
+              <w:top w:type="dxa" w:w="100"/>
+              <w:left w:type="dxa" w:w="140"/>
+              <w:bottom w:type="dxa" w:w="100"/>
+              <w:right w:type="dxa" w:w="140"/>
+            </w:tcMar>
+            <w:vAlign w:val="top"/>
+          </w:tcPr>
+          <w:p>
+            <w:pPr>
+              <w:bidi/>
+              <w:spacing w:after="100" w:line="360"/>
+              <w:jc w:val="both"/>
+            </w:pPr>
+            <w:r>
+              <w:rPr>
+                <w:rFonts w:ascii="Arial" w:cs="Arial" w:eastAsia="Arial" w:hAnsi="Arial"/>
+                <w:b/>
+                <w:bCs/>
+                <w:i w:val="false"/>
+                <w:color w:val="1E1B16"/>
+                <w:sz w:val="26"/>
+                <w:szCs w:val="26"/>
+                <w:rtl/>
+              </w:rPr>
+              <w:t xml:space="preserve">من محاضرات في مسجد بجبال صعدة، إلى سلطة تحكم معظم سكان اليمن وتتحدى قوى إقليمية ودولية.</w:t>
+            </w:r>
+          </w:p>
+          <w:p>
+            <w:pPr>
+              <w:bidi/>
+              <w:spacing w:after="100" w:line="360"/>
+              <w:jc w:val="both"/>
+            </w:pPr>
+            <w:r>
+              <w:rPr>
+                <w:rFonts w:ascii="Arial" w:cs="Arial" w:eastAsia="Arial" w:hAnsi="Arial"/>
+                <w:b/>
+                <w:bCs/>
+                <w:i w:val="false"/>
+                <w:color w:val="1E1B16"/>
+                <w:sz w:val="26"/>
+                <w:szCs w:val="26"/>
+                <w:rtl/>
+              </w:rPr>
+              <w:t xml:space="preserve">قصة الحوثيين هي قصة هوية شعرت بالتهديد، ودولة ضعيفة، وتحالفات تتبدل، وحرب لم تُحسم بعد.</w:t>
+            </w:r>
+          </w:p>
+          <w:p>
+            <w:pPr>
+              <w:bidi/>
+              <w:spacing w:after="100" w:line="360"/>
+              <w:jc w:val="both"/>
+            </w:pPr>
+            <w:r>
+              <w:rPr>
+                <w:rFonts w:ascii="Arial" w:cs="Arial" w:eastAsia="Arial" w:hAnsi="Arial"/>
+                <w:b/>
+                <w:bCs/>
+                <w:i w:val="false"/>
+                <w:color w:val="1E1B16"/>
+                <w:sz w:val="26"/>
+                <w:szCs w:val="26"/>
+                <w:rtl/>
+              </w:rPr>
+              <w:t xml:space="preserve">أما الفصل الأخير من هذه القصة، فلم يُكتب حتى الآن.</w:t>
+            </w:r>
+          </w:p>
+        </w:tc>
+      </w:tr>
+    </w:tbl>
+    <w:p>
+      <w:pPr>
+        <w:bidi/>
+        <w:spacing w:after="120"/>
+      </w:pPr>
+    </w:p>
+    <w:p>
+      <w:pPr>
+        <w:pStyle w:val="Heading1"/>
+        <w:keepNext/>
+        <w:pBdr>
+          <w:bottom w:val="single" w:color="C0392B" w:sz="12" w:space="6"/>
+        </w:pBdr>
+        <w:bidi/>
+        <w:spacing w:after="200" w:before="360"/>
+      </w:pPr>
+      <w:r>
+        <w:rPr>
+          <w:rFonts w:ascii="Arial" w:cs="Arial" w:eastAsia="Arial" w:hAnsi="Arial"/>
+          <w:b/>
+          <w:bCs/>
+          <w:i w:val="false"/>
+          <w:color w:val="C0392B"/>
+          <w:sz w:val="34"/>
+          <w:szCs w:val="34"/>
+          <w:rtl/>
+        </w:rPr>
         <w:t xml:space="preserve">ملاحظات للتسجيل الصوتي</w:t>
       </w:r>
     </w:p>
@@ -7965,7 +8351,7 @@
           <w:szCs w:val="23"/>
           <w:rtl/>
         </w:rPr>
-        <w:t xml:space="preserve"> بعد «لكن موته لم يُنهِ الحركة» (المشهد 7)، وقبل «ثم تغير كل شيء» (المشهد 17)، وقبل الجملة الأخيرة في الخاتمة.</w:t>
+        <w:t xml:space="preserve"> بعد «لكن موته لم يُنهِ الحركة» (المشهد 7)، وقبل «ثم تغير كل شيء» (المشهد 18)، وقبل الجملة الأخيرة في الخاتمة.</w:t>
       </w:r>
     </w:p>
     <w:p>
@@ -7989,7 +8375,7 @@
           <w:szCs w:val="23"/>
           <w:rtl/>
         </w:rPr>
-        <w:t xml:space="preserve">إيقاع المشهد 16 (الثمن الإنساني)</w:t>
+        <w:t xml:space="preserve">إيقاع المشهد 17 (الثمن الإنساني)</w:t>
       </w:r>
       <w:r>
         <w:rPr>
@@ -8238,6 +8624,334 @@
           <w:rtl/>
         </w:rPr>
         <w:t xml:space="preserve"> الصادر عام 2017.</w:t>
+      </w:r>
+    </w:p>
+    <w:p>
+      <w:pPr>
+        <w:pStyle w:val="Heading1"/>
+        <w:keepNext/>
+        <w:pBdr>
+          <w:bottom w:val="single" w:color="C0392B" w:sz="12" w:space="6"/>
+        </w:pBdr>
+        <w:bidi/>
+        <w:spacing w:after="200" w:before="360"/>
+      </w:pPr>
+      <w:r>
+        <w:rPr>
+          <w:rFonts w:ascii="Arial" w:cs="Arial" w:eastAsia="Arial" w:hAnsi="Arial"/>
+          <w:b/>
+          <w:bCs/>
+          <w:i w:val="false"/>
+          <w:color w:val="C0392B"/>
+          <w:sz w:val="34"/>
+          <w:szCs w:val="34"/>
+          <w:rtl/>
+        </w:rPr>
+        <w:t xml:space="preserve">مصادر مشهد جبل الدخان</w:t>
+      </w:r>
+    </w:p>
+    <w:p>
+      <w:pPr>
+        <w:pStyle w:val="ListParagraph"/>
+        <w:numPr>
+          <w:ilvl w:val="0"/>
+          <w:numId w:val="3"/>
+        </w:numPr>
+        <w:bidi/>
+        <w:spacing w:after="80" w:line="300"/>
+      </w:pPr>
+      <w:r>
+        <w:rPr>
+          <w:rFonts w:ascii="Arial" w:cs="Arial" w:eastAsia="Arial" w:hAnsi="Arial"/>
+          <w:b/>
+          <w:bCs/>
+          <w:i w:val="false"/>
+          <w:color w:val="1E1B16"/>
+          <w:sz w:val="23"/>
+          <w:szCs w:val="23"/>
+          <w:rtl/>
+        </w:rPr>
+        <w:t xml:space="preserve">مصدر غربي (وكالة رويترز، عبر موقع </w:t>
+      </w:r>
+      <w:r>
+        <w:rPr>
+          <w:rFonts w:ascii="Arial" w:cs="Arial" w:eastAsia="Arial" w:hAnsi="Arial"/>
+          <w:b/>
+          <w:bCs/>
+          <w:i w:val="false"/>
+          <w:color w:val="1E1B16"/>
+          <w:sz w:val="23"/>
+          <w:szCs w:val="23"/>
+          <w:rtl w:val="false"/>
+        </w:rPr>
+        <w:t xml:space="preserve">swissinfo.ch</w:t>
+      </w:r>
+      <w:r>
+        <w:rPr>
+          <w:rFonts w:ascii="Arial" w:cs="Arial" w:eastAsia="Arial" w:hAnsi="Arial"/>
+          <w:b/>
+          <w:bCs/>
+          <w:i w:val="false"/>
+          <w:color w:val="1E1B16"/>
+          <w:sz w:val="23"/>
+          <w:szCs w:val="23"/>
+          <w:rtl/>
+        </w:rPr>
+        <w:t xml:space="preserve">):</w:t>
+      </w:r>
+      <w:r>
+        <w:rPr>
+          <w:rFonts w:ascii="Arial" w:cs="Arial" w:eastAsia="Arial" w:hAnsi="Arial"/>
+          <w:b w:val="false"/>
+          <w:i w:val="false"/>
+          <w:color w:val="1E1B16"/>
+          <w:sz w:val="23"/>
+          <w:szCs w:val="23"/>
+          <w:rtl/>
+        </w:rPr>
+        <w:t xml:space="preserve"> </w:t>
+      </w:r>
+      <w:hyperlink w:history="1" r:id="rIdel-lgb4pcc4g3vcvfwl-_">
+        <w:r>
+          <w:rPr>
+            <w:rFonts w:ascii="Arial" w:cs="Arial" w:eastAsia="Arial" w:hAnsi="Arial"/>
+            <w:b w:val="false"/>
+            <w:i w:val="false"/>
+            <w:color w:val="1F5F8B"/>
+            <w:sz w:val="23"/>
+            <w:szCs w:val="23"/>
+            <w:u w:val="single"/>
+            <w:rtl w:val="false"/>
+          </w:rPr>
+          <w:t xml:space="preserve">‎Yemen rebels say they seize Saudi border site‎</w:t>
+        </w:r>
+      </w:hyperlink>
+      <w:r>
+        <w:rPr>
+          <w:rFonts w:ascii="Arial" w:cs="Arial" w:eastAsia="Arial" w:hAnsi="Arial"/>
+          <w:b w:val="false"/>
+          <w:i w:val="false"/>
+          <w:color w:val="1E1B16"/>
+          <w:sz w:val="23"/>
+          <w:szCs w:val="23"/>
+          <w:rtl/>
+        </w:rPr>
+        <w:t xml:space="preserve">. يذكر إعلان السلطات السعودية مقتل رجل أمن على يد مسلحين عبروا من اليمن، وإعلان الحوثيين السيطرة على أرض جبلية داخل السعودية.</w:t>
+      </w:r>
+    </w:p>
+    <w:p>
+      <w:pPr>
+        <w:pStyle w:val="ListParagraph"/>
+        <w:numPr>
+          <w:ilvl w:val="0"/>
+          <w:numId w:val="3"/>
+        </w:numPr>
+        <w:bidi/>
+        <w:spacing w:after="80" w:line="300"/>
+      </w:pPr>
+      <w:r>
+        <w:rPr>
+          <w:rFonts w:ascii="Arial" w:cs="Arial" w:eastAsia="Arial" w:hAnsi="Arial"/>
+          <w:b/>
+          <w:bCs/>
+          <w:i w:val="false"/>
+          <w:color w:val="1E1B16"/>
+          <w:sz w:val="23"/>
+          <w:szCs w:val="23"/>
+          <w:rtl/>
+        </w:rPr>
+        <w:t xml:space="preserve">مصدر غربي إضافي (فرانس 24، 8 نوفمبر 2009):</w:t>
+      </w:r>
+      <w:r>
+        <w:rPr>
+          <w:rFonts w:ascii="Arial" w:cs="Arial" w:eastAsia="Arial" w:hAnsi="Arial"/>
+          <w:b w:val="false"/>
+          <w:i w:val="false"/>
+          <w:color w:val="1E1B16"/>
+          <w:sz w:val="23"/>
+          <w:szCs w:val="23"/>
+          <w:rtl/>
+        </w:rPr>
+        <w:t xml:space="preserve"> </w:t>
+      </w:r>
+      <w:hyperlink w:history="1" r:id="rId5rkkyfstcy3puv5dsvqrp">
+        <w:r>
+          <w:rPr>
+            <w:rFonts w:ascii="Arial" w:cs="Arial" w:eastAsia="Arial" w:hAnsi="Arial"/>
+            <w:b w:val="false"/>
+            <w:i w:val="false"/>
+            <w:color w:val="1F5F8B"/>
+            <w:sz w:val="23"/>
+            <w:szCs w:val="23"/>
+            <w:u w:val="single"/>
+            <w:rtl w:val="false"/>
+          </w:rPr>
+          <w:t xml:space="preserve">‎Saudi forces claim to regain control of area seized by Yemen rebels‎</w:t>
+        </w:r>
+      </w:hyperlink>
+      <w:r>
+        <w:rPr>
+          <w:rFonts w:ascii="Arial" w:cs="Arial" w:eastAsia="Arial" w:hAnsi="Arial"/>
+          <w:b w:val="false"/>
+          <w:i w:val="false"/>
+          <w:color w:val="1E1B16"/>
+          <w:sz w:val="23"/>
+          <w:szCs w:val="23"/>
+          <w:rtl/>
+        </w:rPr>
+        <w:t xml:space="preserve">. يتناول إعلان الأمير خالد بن سلطان استعادة جبل الدخان.</w:t>
+      </w:r>
+    </w:p>
+    <w:p>
+      <w:pPr>
+        <w:pStyle w:val="ListParagraph"/>
+        <w:numPr>
+          <w:ilvl w:val="0"/>
+          <w:numId w:val="3"/>
+        </w:numPr>
+        <w:bidi/>
+        <w:spacing w:after="80" w:line="300"/>
+      </w:pPr>
+      <w:r>
+        <w:rPr>
+          <w:rFonts w:ascii="Arial" w:cs="Arial" w:eastAsia="Arial" w:hAnsi="Arial"/>
+          <w:b/>
+          <w:bCs/>
+          <w:i w:val="false"/>
+          <w:color w:val="1E1B16"/>
+          <w:sz w:val="23"/>
+          <w:szCs w:val="23"/>
+          <w:rtl/>
+        </w:rPr>
+        <w:t xml:space="preserve">مصدر عربي (الإمارات اليوم، 5 نوفمبر 2009):</w:t>
+      </w:r>
+      <w:r>
+        <w:rPr>
+          <w:rFonts w:ascii="Arial" w:cs="Arial" w:eastAsia="Arial" w:hAnsi="Arial"/>
+          <w:b w:val="false"/>
+          <w:i w:val="false"/>
+          <w:color w:val="1E1B16"/>
+          <w:sz w:val="23"/>
+          <w:szCs w:val="23"/>
+          <w:rtl/>
+        </w:rPr>
+        <w:t xml:space="preserve"> </w:t>
+      </w:r>
+      <w:hyperlink w:history="1" r:id="rIdobm85utnhh5vdywliwyyb">
+        <w:r>
+          <w:rPr>
+            <w:rFonts w:ascii="Arial" w:cs="Arial" w:eastAsia="Arial" w:hAnsi="Arial"/>
+            <w:b w:val="false"/>
+            <w:i w:val="false"/>
+            <w:color w:val="1F5F8B"/>
+            <w:sz w:val="23"/>
+            <w:szCs w:val="23"/>
+            <w:u w:val="single"/>
+            <w:rtl/>
+          </w:rPr>
+          <w:t xml:space="preserve">الحوثيون يقتلون عسكرياً سعودياً على الحدود مع اليمن</w:t>
+        </w:r>
+      </w:hyperlink>
+      <w:r>
+        <w:rPr>
+          <w:rFonts w:ascii="Arial" w:cs="Arial" w:eastAsia="Arial" w:hAnsi="Arial"/>
+          <w:b w:val="false"/>
+          <w:i w:val="false"/>
+          <w:color w:val="1E1B16"/>
+          <w:sz w:val="23"/>
+          <w:szCs w:val="23"/>
+          <w:rtl/>
+        </w:rPr>
+        <w:t xml:space="preserve">. ينقل بيان وكالة الأنباء السعودية عن مقتل رجل أمن وإصابة 11، وبيان الحوثيين الذي أقرّ بالمواجهات.</w:t>
+      </w:r>
+    </w:p>
+    <w:p>
+      <w:pPr>
+        <w:pStyle w:val="ListParagraph"/>
+        <w:numPr>
+          <w:ilvl w:val="0"/>
+          <w:numId w:val="3"/>
+        </w:numPr>
+        <w:bidi/>
+        <w:spacing w:after="80" w:line="300"/>
+      </w:pPr>
+      <w:r>
+        <w:rPr>
+          <w:rFonts w:ascii="Arial" w:cs="Arial" w:eastAsia="Arial" w:hAnsi="Arial"/>
+          <w:b/>
+          <w:bCs/>
+          <w:i w:val="false"/>
+          <w:color w:val="1E1B16"/>
+          <w:sz w:val="23"/>
+          <w:szCs w:val="23"/>
+          <w:rtl/>
+        </w:rPr>
+        <w:t xml:space="preserve">مصدر عربي إضافي (</w:t>
+      </w:r>
+      <w:r>
+        <w:rPr>
+          <w:rFonts w:ascii="Arial" w:cs="Arial" w:eastAsia="Arial" w:hAnsi="Arial"/>
+          <w:b/>
+          <w:bCs/>
+          <w:i w:val="false"/>
+          <w:color w:val="1E1B16"/>
+          <w:sz w:val="23"/>
+          <w:szCs w:val="23"/>
+          <w:rtl w:val="false"/>
+        </w:rPr>
+        <w:t xml:space="preserve">CNN</w:t>
+      </w:r>
+      <w:r>
+        <w:rPr>
+          <w:rFonts w:ascii="Arial" w:cs="Arial" w:eastAsia="Arial" w:hAnsi="Arial"/>
+          <w:b/>
+          <w:bCs/>
+          <w:i w:val="false"/>
+          <w:color w:val="1E1B16"/>
+          <w:sz w:val="23"/>
+          <w:szCs w:val="23"/>
+          <w:rtl/>
+        </w:rPr>
+        <w:t xml:space="preserve"> بالعربية، 8 نوفمبر 2009):</w:t>
+      </w:r>
+      <w:r>
+        <w:rPr>
+          <w:rFonts w:ascii="Arial" w:cs="Arial" w:eastAsia="Arial" w:hAnsi="Arial"/>
+          <w:b w:val="false"/>
+          <w:i w:val="false"/>
+          <w:color w:val="1E1B16"/>
+          <w:sz w:val="23"/>
+          <w:szCs w:val="23"/>
+          <w:rtl/>
+        </w:rPr>
+        <w:t xml:space="preserve"> </w:t>
+      </w:r>
+      <w:hyperlink w:history="1" r:id="rIdxzvjhsvoxyqocqsrdwfia">
+        <w:r>
+          <w:rPr>
+            <w:rFonts w:ascii="Arial" w:cs="Arial" w:eastAsia="Arial" w:hAnsi="Arial"/>
+            <w:b w:val="false"/>
+            <w:i w:val="false"/>
+            <w:color w:val="1F5F8B"/>
+            <w:sz w:val="23"/>
+            <w:szCs w:val="23"/>
+            <w:u w:val="single"/>
+            <w:rtl/>
+          </w:rPr>
+          <w:t xml:space="preserve">الحوثيون: لم يسقط لنا قتيل واحد في «جبل الدخان»</w:t>
+        </w:r>
+      </w:hyperlink>
+      <w:r>
+        <w:rPr>
+          <w:rFonts w:ascii="Arial" w:cs="Arial" w:eastAsia="Arial" w:hAnsi="Arial"/>
+          <w:b w:val="false"/>
+          <w:i w:val="false"/>
+          <w:color w:val="1E1B16"/>
+          <w:sz w:val="23"/>
+          <w:szCs w:val="23"/>
+          <w:rtl/>
+        </w:rPr>
+        <w:t xml:space="preserve">. يعرض نفي الحوثيين استعادة السعودية للجبل.</w:t>
       </w:r>
     </w:p>
     <w:sectPr>

</xml_diff>

<commit_message>
Add shorter Houthi-Saudi script: doctrine, border clashes and broken truces
Co-Authored-By: Claude Opus 5.5 <noreply@anthropic.com>
Claude-Session: https://claude.ai/code/session_01BzBddbBqnKQREhg3tZEvDi
</commit_message>
<xml_diff>
--- a/video/houthi-history/script.docx
+++ b/video/houthi-history/script.docx
@@ -8711,7 +8711,7 @@
         </w:rPr>
         <w:t xml:space="preserve"> </w:t>
       </w:r>
-      <w:hyperlink w:history="1" r:id="rIdel-lgb4pcc4g3vcvfwl-_">
+      <w:hyperlink w:history="1" r:id="rIdsyqesfvaxgscgiv6vhdmb">
         <w:r>
           <w:rPr>
             <w:rFonts w:ascii="Arial" w:cs="Arial" w:eastAsia="Arial" w:hAnsi="Arial"/>
@@ -8774,7 +8774,7 @@
         </w:rPr>
         <w:t xml:space="preserve"> </w:t>
       </w:r>
-      <w:hyperlink w:history="1" r:id="rId5rkkyfstcy3puv5dsvqrp">
+      <w:hyperlink w:history="1" r:id="rId21pan2mch_3ijg0uhfzlf">
         <w:r>
           <w:rPr>
             <w:rFonts w:ascii="Arial" w:cs="Arial" w:eastAsia="Arial" w:hAnsi="Arial"/>
@@ -8837,7 +8837,7 @@
         </w:rPr>
         <w:t xml:space="preserve"> </w:t>
       </w:r>
-      <w:hyperlink w:history="1" r:id="rIdobm85utnhh5vdywliwyyb">
+      <w:hyperlink w:history="1" r:id="rIduaqnx83953o5qokb4uwsf">
         <w:r>
           <w:rPr>
             <w:rFonts w:ascii="Arial" w:cs="Arial" w:eastAsia="Arial" w:hAnsi="Arial"/>
@@ -8926,7 +8926,7 @@
         </w:rPr>
         <w:t xml:space="preserve"> </w:t>
       </w:r>
-      <w:hyperlink w:history="1" r:id="rIdxzvjhsvoxyqocqsrdwfia">
+      <w:hyperlink w:history="1" r:id="rIdyfdeawhyn27b5pneda9jm">
         <w:r>
           <w:rPr>
             <w:rFonts w:ascii="Arial" w:cs="Arial" w:eastAsia="Arial" w:hAnsi="Arial"/>
@@ -9120,7 +9120,7 @@
         <w:szCs w:val="18"/>
         <w:rtl/>
       </w:rPr>
-      <w:t xml:space="preserve">سكريبت فيديو موشن غرافيك — تاريخ جماعة الحوثي</w:t>
+      <w:t xml:space="preserve">سكريبت فيديو موشن غرافيك — من صعدة إلى البحر الأحمر — تاريخ جماعة الحوثي</w:t>
     </w:r>
   </w:p>
 </w:hdr>

</xml_diff>